<commit_message>
feat: completed Sprint 10: Settings, and Notifications
</commit_message>
<xml_diff>
--- a/Coda Full Description.docx
+++ b/Coda Full Description.docx
@@ -3731,23 +3731,7 @@
                 <w:rFonts w:cs="Times New Roman"/>
                 <w:noProof/>
               </w:rPr>
-              <w:t>Sprint 4: Sm</w:t>
-            </w:r>
-            <w:r>
-              <w:rPr>
-                <w:rStyle w:val="Hyperlink"/>
-                <w:rFonts w:cs="Times New Roman"/>
-                <w:noProof/>
-              </w:rPr>
-              <w:t>a</w:t>
-            </w:r>
-            <w:r>
-              <w:rPr>
-                <w:rStyle w:val="Hyperlink"/>
-                <w:rFonts w:cs="Times New Roman"/>
-                <w:noProof/>
-              </w:rPr>
-              <w:t>rt Search &amp; Filters</w:t>
+              <w:t>Sprint 4: Smart Search &amp; Filters</w:t>
             </w:r>
             <w:r>
               <w:rPr>
@@ -13734,13 +13718,20 @@
         <w:pStyle w:val="Heading2"/>
       </w:pPr>
       <w:r>
-        <w:t>Sprint 12: Build, Packaging, Security Hardening, and Optimization</w:t>
-      </w:r>
-    </w:p>
-    <w:p>
-      <w:pPr>
-        <w:rPr>
-          <w:rFonts w:cs="Times New Roman"/>
+        <w:t>Sprint 1</w:t>
+      </w:r>
+      <w:r>
+        <w:t>2</w:t>
+      </w:r>
+      <w:r>
+        <w:t>: Memory Efficiency &amp; Resource Optimization</w:t>
+      </w:r>
+    </w:p>
+    <w:p>
+      <w:pPr>
+        <w:rPr>
+          <w:rFonts w:cs="Times New Roman"/>
+          <w:szCs w:val="22"/>
         </w:rPr>
       </w:pPr>
       <w:r>
@@ -13748,6 +13739,7 @@
           <w:rFonts w:cs="Times New Roman"/>
           <w:b/>
           <w:bCs/>
+          <w:szCs w:val="22"/>
         </w:rPr>
         <w:t>Goals:</w:t>
       </w:r>
@@ -13756,57 +13748,83 @@
       <w:pPr>
         <w:numPr>
           <w:ilvl w:val="0"/>
-          <w:numId w:val="96"/>
-        </w:numPr>
-        <w:rPr>
-          <w:rFonts w:cs="Times New Roman"/>
-        </w:rPr>
-      </w:pPr>
-      <w:r>
-        <w:rPr>
-          <w:rFonts w:cs="Times New Roman"/>
-        </w:rPr>
-        <w:t xml:space="preserve">Produce production .exe build </w:t>
-      </w:r>
-    </w:p>
-    <w:p>
-      <w:pPr>
-        <w:numPr>
-          <w:ilvl w:val="0"/>
-          <w:numId w:val="96"/>
-        </w:numPr>
-        <w:rPr>
-          <w:rFonts w:cs="Times New Roman"/>
-        </w:rPr>
-      </w:pPr>
-      <w:r>
-        <w:rPr>
-          <w:rFonts w:cs="Times New Roman"/>
-        </w:rPr>
-        <w:t xml:space="preserve">Reduce app size </w:t>
-      </w:r>
-    </w:p>
-    <w:p>
-      <w:pPr>
-        <w:numPr>
-          <w:ilvl w:val="0"/>
-          <w:numId w:val="96"/>
-        </w:numPr>
-        <w:rPr>
-          <w:rFonts w:cs="Times New Roman"/>
-        </w:rPr>
-      </w:pPr>
-      <w:r>
-        <w:rPr>
-          <w:rFonts w:cs="Times New Roman"/>
-        </w:rPr>
-        <w:t xml:space="preserve">Harden security before release </w:t>
-      </w:r>
-    </w:p>
-    <w:p>
-      <w:pPr>
-        <w:rPr>
-          <w:rFonts w:cs="Times New Roman"/>
+          <w:numId w:val="100"/>
+        </w:numPr>
+        <w:rPr>
+          <w:rFonts w:cs="Times New Roman"/>
+          <w:szCs w:val="22"/>
+        </w:rPr>
+      </w:pPr>
+      <w:r>
+        <w:rPr>
+          <w:rFonts w:cs="Times New Roman"/>
+          <w:szCs w:val="22"/>
+        </w:rPr>
+        <w:t xml:space="preserve">Minimize RAM usage </w:t>
+      </w:r>
+    </w:p>
+    <w:p>
+      <w:pPr>
+        <w:numPr>
+          <w:ilvl w:val="0"/>
+          <w:numId w:val="100"/>
+        </w:numPr>
+        <w:rPr>
+          <w:rFonts w:cs="Times New Roman"/>
+          <w:szCs w:val="22"/>
+        </w:rPr>
+      </w:pPr>
+      <w:r>
+        <w:rPr>
+          <w:rFonts w:cs="Times New Roman"/>
+          <w:szCs w:val="22"/>
+        </w:rPr>
+        <w:t xml:space="preserve">Prevent memory leaks </w:t>
+      </w:r>
+    </w:p>
+    <w:p>
+      <w:pPr>
+        <w:numPr>
+          <w:ilvl w:val="0"/>
+          <w:numId w:val="100"/>
+        </w:numPr>
+        <w:rPr>
+          <w:rFonts w:cs="Times New Roman"/>
+          <w:szCs w:val="22"/>
+        </w:rPr>
+      </w:pPr>
+      <w:r>
+        <w:rPr>
+          <w:rFonts w:cs="Times New Roman"/>
+          <w:szCs w:val="22"/>
+        </w:rPr>
+        <w:t xml:space="preserve">Optimize data loading and caching </w:t>
+      </w:r>
+    </w:p>
+    <w:p>
+      <w:pPr>
+        <w:numPr>
+          <w:ilvl w:val="0"/>
+          <w:numId w:val="100"/>
+        </w:numPr>
+        <w:rPr>
+          <w:rFonts w:cs="Times New Roman"/>
+          <w:szCs w:val="22"/>
+        </w:rPr>
+      </w:pPr>
+      <w:r>
+        <w:rPr>
+          <w:rFonts w:cs="Times New Roman"/>
+          <w:szCs w:val="22"/>
+        </w:rPr>
+        <w:t xml:space="preserve">Ensure stable performance with large snippet datasets </w:t>
+      </w:r>
+    </w:p>
+    <w:p>
+      <w:pPr>
+        <w:rPr>
+          <w:rFonts w:cs="Times New Roman"/>
+          <w:szCs w:val="22"/>
         </w:rPr>
       </w:pPr>
       <w:r>
@@ -13814,12 +13832,941 @@
           <w:rFonts w:cs="Times New Roman"/>
           <w:b/>
           <w:bCs/>
+          <w:szCs w:val="22"/>
         </w:rPr>
         <w:t>Tasks:</w:t>
       </w:r>
     </w:p>
     <w:p>
       <w:pPr>
+        <w:rPr>
+          <w:rFonts w:cs="Times New Roman"/>
+          <w:szCs w:val="22"/>
+        </w:rPr>
+      </w:pPr>
+      <w:r>
+        <w:rPr>
+          <w:rFonts w:cs="Times New Roman"/>
+          <w:b/>
+          <w:bCs/>
+          <w:szCs w:val="22"/>
+        </w:rPr>
+        <w:t>Data Handling Optimization</w:t>
+      </w:r>
+    </w:p>
+    <w:p>
+      <w:pPr>
+        <w:numPr>
+          <w:ilvl w:val="0"/>
+          <w:numId w:val="101"/>
+        </w:numPr>
+        <w:rPr>
+          <w:rFonts w:cs="Times New Roman"/>
+          <w:szCs w:val="22"/>
+        </w:rPr>
+      </w:pPr>
+      <w:r>
+        <w:rPr>
+          <w:rFonts w:cs="Times New Roman"/>
+          <w:szCs w:val="22"/>
+        </w:rPr>
+        <w:t xml:space="preserve">Implement pagination or virtualized lists (load only visible snippets) </w:t>
+      </w:r>
+    </w:p>
+    <w:p>
+      <w:pPr>
+        <w:numPr>
+          <w:ilvl w:val="0"/>
+          <w:numId w:val="101"/>
+        </w:numPr>
+        <w:rPr>
+          <w:rFonts w:cs="Times New Roman"/>
+          <w:szCs w:val="22"/>
+        </w:rPr>
+      </w:pPr>
+      <w:r>
+        <w:rPr>
+          <w:rFonts w:cs="Times New Roman"/>
+          <w:szCs w:val="22"/>
+        </w:rPr>
+        <w:t xml:space="preserve">Avoid loading all snippets into global state at startup </w:t>
+      </w:r>
+    </w:p>
+    <w:p>
+      <w:pPr>
+        <w:numPr>
+          <w:ilvl w:val="0"/>
+          <w:numId w:val="101"/>
+        </w:numPr>
+        <w:rPr>
+          <w:rFonts w:cs="Times New Roman"/>
+          <w:szCs w:val="22"/>
+        </w:rPr>
+      </w:pPr>
+      <w:r>
+        <w:rPr>
+          <w:rFonts w:cs="Times New Roman"/>
+          <w:szCs w:val="22"/>
+        </w:rPr>
+        <w:t xml:space="preserve">Lazy-load snippet content (load code only when opened) </w:t>
+      </w:r>
+    </w:p>
+    <w:p>
+      <w:pPr>
+        <w:numPr>
+          <w:ilvl w:val="0"/>
+          <w:numId w:val="101"/>
+        </w:numPr>
+        <w:rPr>
+          <w:rFonts w:cs="Times New Roman"/>
+          <w:szCs w:val="22"/>
+        </w:rPr>
+      </w:pPr>
+      <w:r>
+        <w:rPr>
+          <w:rFonts w:cs="Times New Roman"/>
+          <w:szCs w:val="22"/>
+        </w:rPr>
+        <w:t xml:space="preserve">Normalize state (store IDs instead of full objects where possible) </w:t>
+      </w:r>
+    </w:p>
+    <w:p>
+      <w:pPr>
+        <w:rPr>
+          <w:rFonts w:cs="Times New Roman"/>
+          <w:szCs w:val="22"/>
+        </w:rPr>
+      </w:pPr>
+      <w:r>
+        <w:rPr>
+          <w:rFonts w:cs="Times New Roman"/>
+          <w:b/>
+          <w:bCs/>
+          <w:szCs w:val="22"/>
+        </w:rPr>
+        <w:t>Caching Strategy</w:t>
+      </w:r>
+    </w:p>
+    <w:p>
+      <w:pPr>
+        <w:pStyle w:val="ListParagraph"/>
+        <w:numPr>
+          <w:ilvl w:val="0"/>
+          <w:numId w:val="101"/>
+        </w:numPr>
+        <w:rPr>
+          <w:rFonts w:cs="Times New Roman"/>
+          <w:szCs w:val="22"/>
+        </w:rPr>
+      </w:pPr>
+      <w:r>
+        <w:rPr>
+          <w:rFonts w:cs="Times New Roman"/>
+          <w:szCs w:val="22"/>
+        </w:rPr>
+        <w:t>Add cache size limit (LRU cache for snippets)</w:t>
+      </w:r>
+    </w:p>
+    <w:p>
+      <w:pPr>
+        <w:pStyle w:val="ListParagraph"/>
+        <w:numPr>
+          <w:ilvl w:val="0"/>
+          <w:numId w:val="101"/>
+        </w:numPr>
+        <w:rPr>
+          <w:rFonts w:cs="Times New Roman"/>
+          <w:szCs w:val="22"/>
+        </w:rPr>
+      </w:pPr>
+      <w:r>
+        <w:rPr>
+          <w:rFonts w:cs="Times New Roman"/>
+          <w:szCs w:val="22"/>
+        </w:rPr>
+        <w:t>Evict least-used snippets from memory</w:t>
+      </w:r>
+    </w:p>
+    <w:p>
+      <w:pPr>
+        <w:pStyle w:val="ListParagraph"/>
+        <w:numPr>
+          <w:ilvl w:val="0"/>
+          <w:numId w:val="101"/>
+        </w:numPr>
+        <w:rPr>
+          <w:rFonts w:cs="Times New Roman"/>
+          <w:szCs w:val="22"/>
+        </w:rPr>
+      </w:pPr>
+      <w:r>
+        <w:rPr>
+          <w:rFonts w:cs="Times New Roman"/>
+          <w:szCs w:val="22"/>
+        </w:rPr>
+        <w:t>Avoid duplicate data in cache and state</w:t>
+      </w:r>
+    </w:p>
+    <w:p>
+      <w:pPr>
+        <w:pStyle w:val="ListParagraph"/>
+        <w:numPr>
+          <w:ilvl w:val="0"/>
+          <w:numId w:val="101"/>
+        </w:numPr>
+        <w:rPr>
+          <w:rFonts w:cs="Times New Roman"/>
+          <w:szCs w:val="22"/>
+        </w:rPr>
+      </w:pPr>
+      <w:r>
+        <w:rPr>
+          <w:rFonts w:cs="Times New Roman"/>
+          <w:szCs w:val="22"/>
+        </w:rPr>
+        <w:t>Store heavy data (code content) outside main state when idle</w:t>
+      </w:r>
+    </w:p>
+    <w:p>
+      <w:pPr>
+        <w:rPr>
+          <w:rFonts w:cs="Times New Roman"/>
+          <w:szCs w:val="22"/>
+        </w:rPr>
+      </w:pPr>
+      <w:r>
+        <w:rPr>
+          <w:rFonts w:cs="Times New Roman"/>
+          <w:b/>
+          <w:bCs/>
+          <w:szCs w:val="22"/>
+        </w:rPr>
+        <w:t>Memory Leak Prevention</w:t>
+      </w:r>
+    </w:p>
+    <w:p>
+      <w:pPr>
+        <w:pStyle w:val="ListParagraph"/>
+        <w:numPr>
+          <w:ilvl w:val="0"/>
+          <w:numId w:val="101"/>
+        </w:numPr>
+        <w:rPr>
+          <w:rFonts w:cs="Times New Roman"/>
+          <w:szCs w:val="22"/>
+        </w:rPr>
+      </w:pPr>
+      <w:r>
+        <w:rPr>
+          <w:rFonts w:cs="Times New Roman"/>
+          <w:szCs w:val="22"/>
+        </w:rPr>
+        <w:t>Clean up event listeners on component unmount</w:t>
+      </w:r>
+    </w:p>
+    <w:p>
+      <w:pPr>
+        <w:pStyle w:val="ListParagraph"/>
+        <w:numPr>
+          <w:ilvl w:val="0"/>
+          <w:numId w:val="101"/>
+        </w:numPr>
+        <w:rPr>
+          <w:rFonts w:cs="Times New Roman"/>
+          <w:szCs w:val="22"/>
+        </w:rPr>
+      </w:pPr>
+      <w:r>
+        <w:rPr>
+          <w:rFonts w:cs="Times New Roman"/>
+          <w:szCs w:val="22"/>
+        </w:rPr>
+        <w:t>Clear intervals, timers, and background jobs properly</w:t>
+      </w:r>
+    </w:p>
+    <w:p>
+      <w:pPr>
+        <w:pStyle w:val="ListParagraph"/>
+        <w:numPr>
+          <w:ilvl w:val="0"/>
+          <w:numId w:val="101"/>
+        </w:numPr>
+        <w:rPr>
+          <w:rFonts w:cs="Times New Roman"/>
+          <w:szCs w:val="22"/>
+        </w:rPr>
+      </w:pPr>
+      <w:r>
+        <w:rPr>
+          <w:rFonts w:cs="Times New Roman"/>
+          <w:szCs w:val="22"/>
+        </w:rPr>
+        <w:t>Avoid stale closures in React hooks</w:t>
+      </w:r>
+    </w:p>
+    <w:p>
+      <w:pPr>
+        <w:pStyle w:val="ListParagraph"/>
+        <w:numPr>
+          <w:ilvl w:val="0"/>
+          <w:numId w:val="101"/>
+        </w:numPr>
+        <w:rPr>
+          <w:rFonts w:cs="Times New Roman"/>
+          <w:szCs w:val="22"/>
+        </w:rPr>
+      </w:pPr>
+      <w:r>
+        <w:rPr>
+          <w:rFonts w:cs="Times New Roman"/>
+          <w:szCs w:val="22"/>
+        </w:rPr>
+        <w:t>Audit long-lived references in services</w:t>
+      </w:r>
+    </w:p>
+    <w:p>
+      <w:pPr>
+        <w:rPr>
+          <w:rFonts w:cs="Times New Roman"/>
+          <w:szCs w:val="22"/>
+        </w:rPr>
+      </w:pPr>
+      <w:r>
+        <w:rPr>
+          <w:rFonts w:cs="Times New Roman"/>
+          <w:b/>
+          <w:bCs/>
+          <w:szCs w:val="22"/>
+        </w:rPr>
+        <w:lastRenderedPageBreak/>
+        <w:t>Background Tasks Optimization</w:t>
+      </w:r>
+    </w:p>
+    <w:p>
+      <w:pPr>
+        <w:pStyle w:val="ListParagraph"/>
+        <w:numPr>
+          <w:ilvl w:val="0"/>
+          <w:numId w:val="101"/>
+        </w:numPr>
+        <w:rPr>
+          <w:rFonts w:cs="Times New Roman"/>
+          <w:szCs w:val="22"/>
+        </w:rPr>
+      </w:pPr>
+      <w:r>
+        <w:rPr>
+          <w:rFonts w:cs="Times New Roman"/>
+          <w:szCs w:val="22"/>
+        </w:rPr>
+        <w:t>Throttle background jobs (indexing, analytics, recommendations)</w:t>
+      </w:r>
+    </w:p>
+    <w:p>
+      <w:pPr>
+        <w:pStyle w:val="ListParagraph"/>
+        <w:numPr>
+          <w:ilvl w:val="0"/>
+          <w:numId w:val="101"/>
+        </w:numPr>
+        <w:rPr>
+          <w:rFonts w:cs="Times New Roman"/>
+          <w:szCs w:val="22"/>
+        </w:rPr>
+      </w:pPr>
+      <w:r>
+        <w:rPr>
+          <w:rFonts w:cs="Times New Roman"/>
+          <w:szCs w:val="22"/>
+        </w:rPr>
+        <w:t>Move heavy computation to Rust backend (Tauri side)</w:t>
+      </w:r>
+    </w:p>
+    <w:p>
+      <w:pPr>
+        <w:pStyle w:val="ListParagraph"/>
+        <w:numPr>
+          <w:ilvl w:val="0"/>
+          <w:numId w:val="101"/>
+        </w:numPr>
+        <w:rPr>
+          <w:rFonts w:cs="Times New Roman"/>
+          <w:szCs w:val="22"/>
+        </w:rPr>
+      </w:pPr>
+      <w:r>
+        <w:rPr>
+          <w:rFonts w:cs="Times New Roman"/>
+          <w:szCs w:val="22"/>
+        </w:rPr>
+        <w:t>Batch operations instead of frequent small updates</w:t>
+      </w:r>
+    </w:p>
+    <w:p>
+      <w:pPr>
+        <w:rPr>
+          <w:rFonts w:cs="Times New Roman"/>
+          <w:szCs w:val="22"/>
+        </w:rPr>
+      </w:pPr>
+      <w:r>
+        <w:rPr>
+          <w:rFonts w:cs="Times New Roman"/>
+          <w:b/>
+          <w:bCs/>
+          <w:szCs w:val="22"/>
+        </w:rPr>
+        <w:t>Rendering Optimization</w:t>
+      </w:r>
+    </w:p>
+    <w:p>
+      <w:pPr>
+        <w:pStyle w:val="ListParagraph"/>
+        <w:numPr>
+          <w:ilvl w:val="0"/>
+          <w:numId w:val="101"/>
+        </w:numPr>
+        <w:rPr>
+          <w:rFonts w:cs="Times New Roman"/>
+          <w:szCs w:val="22"/>
+        </w:rPr>
+      </w:pPr>
+      <w:r>
+        <w:rPr>
+          <w:rFonts w:cs="Times New Roman"/>
+          <w:szCs w:val="22"/>
+        </w:rPr>
+        <w:t xml:space="preserve">Use React </w:t>
+      </w:r>
+      <w:proofErr w:type="spellStart"/>
+      <w:r>
+        <w:rPr>
+          <w:rFonts w:cs="Times New Roman"/>
+          <w:szCs w:val="22"/>
+        </w:rPr>
+        <w:t>memoization</w:t>
+      </w:r>
+      <w:proofErr w:type="spellEnd"/>
+      <w:r>
+        <w:rPr>
+          <w:rFonts w:cs="Times New Roman"/>
+          <w:szCs w:val="22"/>
+        </w:rPr>
+        <w:t xml:space="preserve"> (memo, </w:t>
+      </w:r>
+      <w:proofErr w:type="spellStart"/>
+      <w:r>
+        <w:rPr>
+          <w:rFonts w:cs="Times New Roman"/>
+          <w:szCs w:val="22"/>
+        </w:rPr>
+        <w:t>useMemo</w:t>
+      </w:r>
+      <w:proofErr w:type="spellEnd"/>
+      <w:r>
+        <w:rPr>
+          <w:rFonts w:cs="Times New Roman"/>
+          <w:szCs w:val="22"/>
+        </w:rPr>
+        <w:t xml:space="preserve">, </w:t>
+      </w:r>
+      <w:proofErr w:type="spellStart"/>
+      <w:r>
+        <w:rPr>
+          <w:rFonts w:cs="Times New Roman"/>
+          <w:szCs w:val="22"/>
+        </w:rPr>
+        <w:t>useCallback</w:t>
+      </w:r>
+      <w:proofErr w:type="spellEnd"/>
+      <w:r>
+        <w:rPr>
+          <w:rFonts w:cs="Times New Roman"/>
+          <w:szCs w:val="22"/>
+        </w:rPr>
+        <w:t>)</w:t>
+      </w:r>
+    </w:p>
+    <w:p>
+      <w:pPr>
+        <w:pStyle w:val="ListParagraph"/>
+        <w:numPr>
+          <w:ilvl w:val="0"/>
+          <w:numId w:val="101"/>
+        </w:numPr>
+        <w:rPr>
+          <w:rFonts w:cs="Times New Roman"/>
+          <w:szCs w:val="22"/>
+        </w:rPr>
+      </w:pPr>
+      <w:r>
+        <w:rPr>
+          <w:rFonts w:cs="Times New Roman"/>
+          <w:szCs w:val="22"/>
+        </w:rPr>
+        <w:t>Prevent unnecessary re-renders (state slicing)</w:t>
+      </w:r>
+    </w:p>
+    <w:p>
+      <w:pPr>
+        <w:pStyle w:val="ListParagraph"/>
+        <w:numPr>
+          <w:ilvl w:val="0"/>
+          <w:numId w:val="101"/>
+        </w:numPr>
+        <w:rPr>
+          <w:rFonts w:cs="Times New Roman"/>
+          <w:szCs w:val="22"/>
+        </w:rPr>
+      </w:pPr>
+      <w:r>
+        <w:rPr>
+          <w:rFonts w:cs="Times New Roman"/>
+          <w:szCs w:val="22"/>
+        </w:rPr>
+        <w:t>Avoid large prop drilling</w:t>
+      </w:r>
+    </w:p>
+    <w:p>
+      <w:pPr>
+        <w:pStyle w:val="ListParagraph"/>
+        <w:numPr>
+          <w:ilvl w:val="0"/>
+          <w:numId w:val="101"/>
+        </w:numPr>
+        <w:rPr>
+          <w:rFonts w:cs="Times New Roman"/>
+          <w:szCs w:val="22"/>
+        </w:rPr>
+      </w:pPr>
+      <w:r>
+        <w:rPr>
+          <w:rFonts w:cs="Times New Roman"/>
+          <w:szCs w:val="22"/>
+        </w:rPr>
+        <w:t>Split large components into smaller isolated ones</w:t>
+      </w:r>
+    </w:p>
+    <w:p>
+      <w:pPr>
+        <w:rPr>
+          <w:rFonts w:cs="Times New Roman"/>
+          <w:szCs w:val="22"/>
+        </w:rPr>
+      </w:pPr>
+      <w:r>
+        <w:rPr>
+          <w:rFonts w:cs="Times New Roman"/>
+          <w:b/>
+          <w:bCs/>
+          <w:szCs w:val="22"/>
+        </w:rPr>
+        <w:t>Database Optimization</w:t>
+      </w:r>
+    </w:p>
+    <w:p>
+      <w:pPr>
+        <w:pStyle w:val="ListParagraph"/>
+        <w:numPr>
+          <w:ilvl w:val="0"/>
+          <w:numId w:val="101"/>
+        </w:numPr>
+        <w:rPr>
+          <w:rFonts w:cs="Times New Roman"/>
+          <w:szCs w:val="22"/>
+        </w:rPr>
+      </w:pPr>
+      <w:r>
+        <w:rPr>
+          <w:rFonts w:cs="Times New Roman"/>
+          <w:szCs w:val="22"/>
+        </w:rPr>
+        <w:t>Use indexed queries only</w:t>
+      </w:r>
+    </w:p>
+    <w:p>
+      <w:pPr>
+        <w:pStyle w:val="ListParagraph"/>
+        <w:numPr>
+          <w:ilvl w:val="0"/>
+          <w:numId w:val="101"/>
+        </w:numPr>
+        <w:rPr>
+          <w:rFonts w:cs="Times New Roman"/>
+          <w:szCs w:val="22"/>
+        </w:rPr>
+      </w:pPr>
+      <w:r>
+        <w:rPr>
+          <w:rFonts w:cs="Times New Roman"/>
+          <w:szCs w:val="22"/>
+        </w:rPr>
+        <w:t>Avoid full table scans</w:t>
+      </w:r>
+    </w:p>
+    <w:p>
+      <w:pPr>
+        <w:pStyle w:val="ListParagraph"/>
+        <w:numPr>
+          <w:ilvl w:val="0"/>
+          <w:numId w:val="101"/>
+        </w:numPr>
+        <w:rPr>
+          <w:rFonts w:cs="Times New Roman"/>
+          <w:szCs w:val="22"/>
+        </w:rPr>
+      </w:pPr>
+      <w:r>
+        <w:rPr>
+          <w:rFonts w:cs="Times New Roman"/>
+          <w:szCs w:val="22"/>
+        </w:rPr>
+        <w:t>Limit query result size</w:t>
+      </w:r>
+    </w:p>
+    <w:p>
+      <w:pPr>
+        <w:pStyle w:val="ListParagraph"/>
+        <w:numPr>
+          <w:ilvl w:val="0"/>
+          <w:numId w:val="101"/>
+        </w:numPr>
+        <w:rPr>
+          <w:rFonts w:cs="Times New Roman"/>
+          <w:szCs w:val="22"/>
+        </w:rPr>
+      </w:pPr>
+      <w:r>
+        <w:rPr>
+          <w:rFonts w:cs="Times New Roman"/>
+          <w:szCs w:val="22"/>
+        </w:rPr>
+        <w:t>Close unused DB connections</w:t>
+      </w:r>
+    </w:p>
+    <w:p>
+      <w:pPr>
+        <w:rPr>
+          <w:rFonts w:cs="Times New Roman"/>
+          <w:szCs w:val="22"/>
+        </w:rPr>
+      </w:pPr>
+      <w:r>
+        <w:rPr>
+          <w:rFonts w:cs="Times New Roman"/>
+          <w:b/>
+          <w:bCs/>
+          <w:szCs w:val="22"/>
+        </w:rPr>
+        <w:t>Monitoring &amp; Limits</w:t>
+      </w:r>
+    </w:p>
+    <w:p>
+      <w:pPr>
+        <w:pStyle w:val="ListParagraph"/>
+        <w:numPr>
+          <w:ilvl w:val="0"/>
+          <w:numId w:val="101"/>
+        </w:numPr>
+        <w:rPr>
+          <w:rFonts w:cs="Times New Roman"/>
+          <w:szCs w:val="22"/>
+        </w:rPr>
+      </w:pPr>
+      <w:r>
+        <w:rPr>
+          <w:rFonts w:cs="Times New Roman"/>
+          <w:szCs w:val="22"/>
+        </w:rPr>
+        <w:t>Track memory usage periodically</w:t>
+      </w:r>
+    </w:p>
+    <w:p>
+      <w:pPr>
+        <w:pStyle w:val="ListParagraph"/>
+        <w:numPr>
+          <w:ilvl w:val="0"/>
+          <w:numId w:val="101"/>
+        </w:numPr>
+        <w:rPr>
+          <w:rFonts w:cs="Times New Roman"/>
+          <w:szCs w:val="22"/>
+        </w:rPr>
+      </w:pPr>
+      <w:r>
+        <w:rPr>
+          <w:rFonts w:cs="Times New Roman"/>
+          <w:szCs w:val="22"/>
+        </w:rPr>
+        <w:t>Set memory thresholds (warn if exceeded)</w:t>
+      </w:r>
+    </w:p>
+    <w:p>
+      <w:pPr>
+        <w:pStyle w:val="ListParagraph"/>
+        <w:numPr>
+          <w:ilvl w:val="0"/>
+          <w:numId w:val="101"/>
+        </w:numPr>
+        <w:rPr>
+          <w:rFonts w:cs="Times New Roman"/>
+          <w:szCs w:val="22"/>
+        </w:rPr>
+      </w:pPr>
+      <w:r>
+        <w:rPr>
+          <w:rFonts w:cs="Times New Roman"/>
+          <w:szCs w:val="22"/>
+        </w:rPr>
+        <w:t>Log high memory spikes</w:t>
+      </w:r>
+    </w:p>
+    <w:p>
+      <w:pPr>
+        <w:pStyle w:val="ListParagraph"/>
+        <w:numPr>
+          <w:ilvl w:val="0"/>
+          <w:numId w:val="101"/>
+        </w:numPr>
+        <w:rPr>
+          <w:rFonts w:cs="Times New Roman"/>
+          <w:szCs w:val="22"/>
+        </w:rPr>
+      </w:pPr>
+      <w:r>
+        <w:rPr>
+          <w:rFonts w:cs="Times New Roman"/>
+          <w:szCs w:val="22"/>
+        </w:rPr>
+        <w:t>Add debug mode for memory profiling</w:t>
+      </w:r>
+    </w:p>
+    <w:p>
+      <w:pPr>
+        <w:rPr>
+          <w:rFonts w:cs="Times New Roman"/>
+          <w:szCs w:val="22"/>
+        </w:rPr>
+      </w:pPr>
+      <w:r>
+        <w:rPr>
+          <w:rFonts w:cs="Times New Roman"/>
+          <w:b/>
+          <w:bCs/>
+          <w:szCs w:val="22"/>
+        </w:rPr>
+        <w:t>Deliverables:</w:t>
+      </w:r>
+    </w:p>
+    <w:p>
+      <w:pPr>
+        <w:numPr>
+          <w:ilvl w:val="0"/>
+          <w:numId w:val="102"/>
+        </w:numPr>
+        <w:rPr>
+          <w:rFonts w:cs="Times New Roman"/>
+          <w:szCs w:val="22"/>
+        </w:rPr>
+      </w:pPr>
+      <w:r>
+        <w:rPr>
+          <w:rFonts w:cs="Times New Roman"/>
+          <w:szCs w:val="22"/>
+        </w:rPr>
+        <w:t xml:space="preserve">Reduced memory footprint under normal usage </w:t>
+      </w:r>
+    </w:p>
+    <w:p>
+      <w:pPr>
+        <w:numPr>
+          <w:ilvl w:val="0"/>
+          <w:numId w:val="102"/>
+        </w:numPr>
+        <w:rPr>
+          <w:rFonts w:cs="Times New Roman"/>
+          <w:szCs w:val="22"/>
+        </w:rPr>
+      </w:pPr>
+      <w:r>
+        <w:rPr>
+          <w:rFonts w:cs="Times New Roman"/>
+          <w:szCs w:val="22"/>
+        </w:rPr>
+        <w:t xml:space="preserve">Stable performance with large datasets (1000+ snippets) </w:t>
+      </w:r>
+    </w:p>
+    <w:p>
+      <w:pPr>
+        <w:numPr>
+          <w:ilvl w:val="0"/>
+          <w:numId w:val="102"/>
+        </w:numPr>
+        <w:rPr>
+          <w:rFonts w:cs="Times New Roman"/>
+          <w:szCs w:val="22"/>
+        </w:rPr>
+      </w:pPr>
+      <w:r>
+        <w:rPr>
+          <w:rFonts w:cs="Times New Roman"/>
+          <w:szCs w:val="22"/>
+        </w:rPr>
+        <w:t xml:space="preserve">No detectable memory leaks </w:t>
+      </w:r>
+    </w:p>
+    <w:p>
+      <w:pPr>
+        <w:numPr>
+          <w:ilvl w:val="0"/>
+          <w:numId w:val="102"/>
+        </w:numPr>
+        <w:rPr>
+          <w:rFonts w:cs="Times New Roman"/>
+          <w:szCs w:val="22"/>
+        </w:rPr>
+      </w:pPr>
+      <w:r>
+        <w:rPr>
+          <w:rFonts w:cs="Times New Roman"/>
+          <w:szCs w:val="22"/>
+        </w:rPr>
+        <w:t xml:space="preserve">Memory monitoring system integrated </w:t>
+      </w:r>
+    </w:p>
+    <w:p>
+      <w:pPr>
+        <w:rPr>
+          <w:rFonts w:cs="Times New Roman"/>
+          <w:szCs w:val="22"/>
+        </w:rPr>
+      </w:pPr>
+      <w:r>
+        <w:rPr>
+          <w:rFonts w:cs="Times New Roman"/>
+          <w:b/>
+          <w:bCs/>
+          <w:szCs w:val="22"/>
+        </w:rPr>
+        <w:t>Pages Implemented:</w:t>
+      </w:r>
+    </w:p>
+    <w:p>
+      <w:pPr>
+        <w:numPr>
+          <w:ilvl w:val="0"/>
+          <w:numId w:val="103"/>
+        </w:numPr>
+        <w:rPr>
+          <w:rFonts w:cs="Times New Roman"/>
+          <w:szCs w:val="22"/>
+        </w:rPr>
+      </w:pPr>
+      <w:r>
+        <w:rPr>
+          <w:rFonts w:cs="Times New Roman"/>
+          <w:szCs w:val="22"/>
+        </w:rPr>
+        <w:t>None (engineering sprint)</w:t>
+      </w:r>
+    </w:p>
+    <w:p>
+      <w:pPr>
+        <w:pStyle w:val="Heading2"/>
+      </w:pPr>
+      <w:r>
+        <w:t>Sprint 1</w:t>
+      </w:r>
+      <w:r>
+        <w:t>3</w:t>
+      </w:r>
+      <w:r>
+        <w:t>: Build, Packaging, Security Hardening, and Optimization</w:t>
+      </w:r>
+    </w:p>
+    <w:p>
+      <w:pPr>
+        <w:rPr>
+          <w:rFonts w:cs="Times New Roman"/>
+        </w:rPr>
+      </w:pPr>
+      <w:r>
+        <w:rPr>
+          <w:rFonts w:cs="Times New Roman"/>
+          <w:b/>
+          <w:bCs/>
+        </w:rPr>
+        <w:t>Goals:</w:t>
+      </w:r>
+    </w:p>
+    <w:p>
+      <w:pPr>
+        <w:numPr>
+          <w:ilvl w:val="0"/>
+          <w:numId w:val="96"/>
+        </w:numPr>
+        <w:rPr>
+          <w:rFonts w:cs="Times New Roman"/>
+        </w:rPr>
+      </w:pPr>
+      <w:r>
+        <w:rPr>
+          <w:rFonts w:cs="Times New Roman"/>
+        </w:rPr>
+        <w:t xml:space="preserve">Produce production .exe build </w:t>
+      </w:r>
+    </w:p>
+    <w:p>
+      <w:pPr>
+        <w:numPr>
+          <w:ilvl w:val="0"/>
+          <w:numId w:val="96"/>
+        </w:numPr>
+        <w:rPr>
+          <w:rFonts w:cs="Times New Roman"/>
+        </w:rPr>
+      </w:pPr>
+      <w:r>
+        <w:rPr>
+          <w:rFonts w:cs="Times New Roman"/>
+        </w:rPr>
+        <w:t xml:space="preserve">Reduce app size </w:t>
+      </w:r>
+    </w:p>
+    <w:p>
+      <w:pPr>
+        <w:numPr>
+          <w:ilvl w:val="0"/>
+          <w:numId w:val="96"/>
+        </w:numPr>
+        <w:rPr>
+          <w:rFonts w:cs="Times New Roman"/>
+        </w:rPr>
+      </w:pPr>
+      <w:r>
+        <w:rPr>
+          <w:rFonts w:cs="Times New Roman"/>
+        </w:rPr>
+        <w:t xml:space="preserve">Harden security before release </w:t>
+      </w:r>
+    </w:p>
+    <w:p>
+      <w:pPr>
+        <w:rPr>
+          <w:rFonts w:cs="Times New Roman"/>
+        </w:rPr>
+      </w:pPr>
+      <w:r>
+        <w:rPr>
+          <w:rFonts w:cs="Times New Roman"/>
+          <w:b/>
+          <w:bCs/>
+        </w:rPr>
+        <w:t>Tasks:</w:t>
+      </w:r>
+    </w:p>
+    <w:p>
+      <w:pPr>
         <w:numPr>
           <w:ilvl w:val="0"/>
           <w:numId w:val="97"/>
@@ -13934,6 +14881,7 @@
         <w:rPr>
           <w:rFonts w:cs="Times New Roman"/>
         </w:rPr>
+        <w:lastRenderedPageBreak/>
         <w:t xml:space="preserve">Disable unsafe browser APIs (eval, remote URLs) </w:t>
       </w:r>
     </w:p>
@@ -14084,7 +15032,6 @@
         <w:rPr>
           <w:rFonts w:cs="Times New Roman"/>
         </w:rPr>
-        <w:lastRenderedPageBreak/>
         <w:t xml:space="preserve">Test clean install on fresh Windows VM </w:t>
       </w:r>
     </w:p>
@@ -14868,6 +15815,119 @@
     </w:lvl>
   </w:abstractNum>
   <w:abstractNum w:abstractNumId="3" w15:restartNumberingAfterBreak="0">
+    <w:nsid w:val="03475EDE"/>
+    <w:multiLevelType w:val="multilevel"/>
+    <w:tmpl w:val="717622B0"/>
+    <w:lvl w:ilvl="0">
+      <w:start w:val="1"/>
+      <w:numFmt w:val="decimal"/>
+      <w:lvlText w:val="%1."/>
+      <w:lvlJc w:val="left"/>
+      <w:pPr>
+        <w:tabs>
+          <w:tab w:val="num" w:pos="720"/>
+        </w:tabs>
+        <w:ind w:left="720" w:hanging="360"/>
+      </w:pPr>
+    </w:lvl>
+    <w:lvl w:ilvl="1" w:tentative="1">
+      <w:start w:val="1"/>
+      <w:numFmt w:val="decimal"/>
+      <w:lvlText w:val="%2."/>
+      <w:lvlJc w:val="left"/>
+      <w:pPr>
+        <w:tabs>
+          <w:tab w:val="num" w:pos="1440"/>
+        </w:tabs>
+        <w:ind w:left="1440" w:hanging="360"/>
+      </w:pPr>
+    </w:lvl>
+    <w:lvl w:ilvl="2" w:tentative="1">
+      <w:start w:val="1"/>
+      <w:numFmt w:val="decimal"/>
+      <w:lvlText w:val="%3."/>
+      <w:lvlJc w:val="left"/>
+      <w:pPr>
+        <w:tabs>
+          <w:tab w:val="num" w:pos="2160"/>
+        </w:tabs>
+        <w:ind w:left="2160" w:hanging="360"/>
+      </w:pPr>
+    </w:lvl>
+    <w:lvl w:ilvl="3" w:tentative="1">
+      <w:start w:val="1"/>
+      <w:numFmt w:val="decimal"/>
+      <w:lvlText w:val="%4."/>
+      <w:lvlJc w:val="left"/>
+      <w:pPr>
+        <w:tabs>
+          <w:tab w:val="num" w:pos="2880"/>
+        </w:tabs>
+        <w:ind w:left="2880" w:hanging="360"/>
+      </w:pPr>
+    </w:lvl>
+    <w:lvl w:ilvl="4" w:tentative="1">
+      <w:start w:val="1"/>
+      <w:numFmt w:val="decimal"/>
+      <w:lvlText w:val="%5."/>
+      <w:lvlJc w:val="left"/>
+      <w:pPr>
+        <w:tabs>
+          <w:tab w:val="num" w:pos="3600"/>
+        </w:tabs>
+        <w:ind w:left="3600" w:hanging="360"/>
+      </w:pPr>
+    </w:lvl>
+    <w:lvl w:ilvl="5" w:tentative="1">
+      <w:start w:val="1"/>
+      <w:numFmt w:val="decimal"/>
+      <w:lvlText w:val="%6."/>
+      <w:lvlJc w:val="left"/>
+      <w:pPr>
+        <w:tabs>
+          <w:tab w:val="num" w:pos="4320"/>
+        </w:tabs>
+        <w:ind w:left="4320" w:hanging="360"/>
+      </w:pPr>
+    </w:lvl>
+    <w:lvl w:ilvl="6" w:tentative="1">
+      <w:start w:val="1"/>
+      <w:numFmt w:val="decimal"/>
+      <w:lvlText w:val="%7."/>
+      <w:lvlJc w:val="left"/>
+      <w:pPr>
+        <w:tabs>
+          <w:tab w:val="num" w:pos="5040"/>
+        </w:tabs>
+        <w:ind w:left="5040" w:hanging="360"/>
+      </w:pPr>
+    </w:lvl>
+    <w:lvl w:ilvl="7" w:tentative="1">
+      <w:start w:val="1"/>
+      <w:numFmt w:val="decimal"/>
+      <w:lvlText w:val="%8."/>
+      <w:lvlJc w:val="left"/>
+      <w:pPr>
+        <w:tabs>
+          <w:tab w:val="num" w:pos="5760"/>
+        </w:tabs>
+        <w:ind w:left="5760" w:hanging="360"/>
+      </w:pPr>
+    </w:lvl>
+    <w:lvl w:ilvl="8" w:tentative="1">
+      <w:start w:val="1"/>
+      <w:numFmt w:val="decimal"/>
+      <w:lvlText w:val="%9."/>
+      <w:lvlJc w:val="left"/>
+      <w:pPr>
+        <w:tabs>
+          <w:tab w:val="num" w:pos="6480"/>
+        </w:tabs>
+        <w:ind w:left="6480" w:hanging="360"/>
+      </w:pPr>
+    </w:lvl>
+  </w:abstractNum>
+  <w:abstractNum w:abstractNumId="4" w15:restartNumberingAfterBreak="0">
     <w:nsid w:val="04607FC9"/>
     <w:multiLevelType w:val="multilevel"/>
     <w:tmpl w:val="36222EFA"/>
@@ -15016,7 +16076,7 @@
       </w:rPr>
     </w:lvl>
   </w:abstractNum>
-  <w:abstractNum w:abstractNumId="4" w15:restartNumberingAfterBreak="0">
+  <w:abstractNum w:abstractNumId="5" w15:restartNumberingAfterBreak="0">
     <w:nsid w:val="049C7B72"/>
     <w:multiLevelType w:val="multilevel"/>
     <w:tmpl w:val="31F2A230"/>
@@ -15165,7 +16225,7 @@
       </w:rPr>
     </w:lvl>
   </w:abstractNum>
-  <w:abstractNum w:abstractNumId="5" w15:restartNumberingAfterBreak="0">
+  <w:abstractNum w:abstractNumId="6" w15:restartNumberingAfterBreak="0">
     <w:nsid w:val="058022D4"/>
     <w:multiLevelType w:val="multilevel"/>
     <w:tmpl w:val="BEC89872"/>
@@ -15314,7 +16374,7 @@
       </w:rPr>
     </w:lvl>
   </w:abstractNum>
-  <w:abstractNum w:abstractNumId="6" w15:restartNumberingAfterBreak="0">
+  <w:abstractNum w:abstractNumId="7" w15:restartNumberingAfterBreak="0">
     <w:nsid w:val="06977B43"/>
     <w:multiLevelType w:val="multilevel"/>
     <w:tmpl w:val="3AD2F86A"/>
@@ -15427,7 +16487,7 @@
       </w:pPr>
     </w:lvl>
   </w:abstractNum>
-  <w:abstractNum w:abstractNumId="7" w15:restartNumberingAfterBreak="0">
+  <w:abstractNum w:abstractNumId="8" w15:restartNumberingAfterBreak="0">
     <w:nsid w:val="09B62B2E"/>
     <w:multiLevelType w:val="multilevel"/>
     <w:tmpl w:val="9138B314"/>
@@ -15540,7 +16600,7 @@
       </w:pPr>
     </w:lvl>
   </w:abstractNum>
-  <w:abstractNum w:abstractNumId="8" w15:restartNumberingAfterBreak="0">
+  <w:abstractNum w:abstractNumId="9" w15:restartNumberingAfterBreak="0">
     <w:nsid w:val="0C41430A"/>
     <w:multiLevelType w:val="multilevel"/>
     <w:tmpl w:val="575CDB04"/>
@@ -15653,7 +16713,120 @@
       </w:pPr>
     </w:lvl>
   </w:abstractNum>
-  <w:abstractNum w:abstractNumId="9" w15:restartNumberingAfterBreak="0">
+  <w:abstractNum w:abstractNumId="10" w15:restartNumberingAfterBreak="0">
+    <w:nsid w:val="0D3E47A2"/>
+    <w:multiLevelType w:val="multilevel"/>
+    <w:tmpl w:val="717622B0"/>
+    <w:lvl w:ilvl="0">
+      <w:start w:val="1"/>
+      <w:numFmt w:val="decimal"/>
+      <w:lvlText w:val="%1."/>
+      <w:lvlJc w:val="left"/>
+      <w:pPr>
+        <w:tabs>
+          <w:tab w:val="num" w:pos="720"/>
+        </w:tabs>
+        <w:ind w:left="720" w:hanging="360"/>
+      </w:pPr>
+    </w:lvl>
+    <w:lvl w:ilvl="1" w:tentative="1">
+      <w:start w:val="1"/>
+      <w:numFmt w:val="decimal"/>
+      <w:lvlText w:val="%2."/>
+      <w:lvlJc w:val="left"/>
+      <w:pPr>
+        <w:tabs>
+          <w:tab w:val="num" w:pos="1440"/>
+        </w:tabs>
+        <w:ind w:left="1440" w:hanging="360"/>
+      </w:pPr>
+    </w:lvl>
+    <w:lvl w:ilvl="2" w:tentative="1">
+      <w:start w:val="1"/>
+      <w:numFmt w:val="decimal"/>
+      <w:lvlText w:val="%3."/>
+      <w:lvlJc w:val="left"/>
+      <w:pPr>
+        <w:tabs>
+          <w:tab w:val="num" w:pos="2160"/>
+        </w:tabs>
+        <w:ind w:left="2160" w:hanging="360"/>
+      </w:pPr>
+    </w:lvl>
+    <w:lvl w:ilvl="3" w:tentative="1">
+      <w:start w:val="1"/>
+      <w:numFmt w:val="decimal"/>
+      <w:lvlText w:val="%4."/>
+      <w:lvlJc w:val="left"/>
+      <w:pPr>
+        <w:tabs>
+          <w:tab w:val="num" w:pos="2880"/>
+        </w:tabs>
+        <w:ind w:left="2880" w:hanging="360"/>
+      </w:pPr>
+    </w:lvl>
+    <w:lvl w:ilvl="4" w:tentative="1">
+      <w:start w:val="1"/>
+      <w:numFmt w:val="decimal"/>
+      <w:lvlText w:val="%5."/>
+      <w:lvlJc w:val="left"/>
+      <w:pPr>
+        <w:tabs>
+          <w:tab w:val="num" w:pos="3600"/>
+        </w:tabs>
+        <w:ind w:left="3600" w:hanging="360"/>
+      </w:pPr>
+    </w:lvl>
+    <w:lvl w:ilvl="5" w:tentative="1">
+      <w:start w:val="1"/>
+      <w:numFmt w:val="decimal"/>
+      <w:lvlText w:val="%6."/>
+      <w:lvlJc w:val="left"/>
+      <w:pPr>
+        <w:tabs>
+          <w:tab w:val="num" w:pos="4320"/>
+        </w:tabs>
+        <w:ind w:left="4320" w:hanging="360"/>
+      </w:pPr>
+    </w:lvl>
+    <w:lvl w:ilvl="6" w:tentative="1">
+      <w:start w:val="1"/>
+      <w:numFmt w:val="decimal"/>
+      <w:lvlText w:val="%7."/>
+      <w:lvlJc w:val="left"/>
+      <w:pPr>
+        <w:tabs>
+          <w:tab w:val="num" w:pos="5040"/>
+        </w:tabs>
+        <w:ind w:left="5040" w:hanging="360"/>
+      </w:pPr>
+    </w:lvl>
+    <w:lvl w:ilvl="7" w:tentative="1">
+      <w:start w:val="1"/>
+      <w:numFmt w:val="decimal"/>
+      <w:lvlText w:val="%8."/>
+      <w:lvlJc w:val="left"/>
+      <w:pPr>
+        <w:tabs>
+          <w:tab w:val="num" w:pos="5760"/>
+        </w:tabs>
+        <w:ind w:left="5760" w:hanging="360"/>
+      </w:pPr>
+    </w:lvl>
+    <w:lvl w:ilvl="8" w:tentative="1">
+      <w:start w:val="1"/>
+      <w:numFmt w:val="decimal"/>
+      <w:lvlText w:val="%9."/>
+      <w:lvlJc w:val="left"/>
+      <w:pPr>
+        <w:tabs>
+          <w:tab w:val="num" w:pos="6480"/>
+        </w:tabs>
+        <w:ind w:left="6480" w:hanging="360"/>
+      </w:pPr>
+    </w:lvl>
+  </w:abstractNum>
+  <w:abstractNum w:abstractNumId="11" w15:restartNumberingAfterBreak="0">
     <w:nsid w:val="0DDB3EAF"/>
     <w:multiLevelType w:val="multilevel"/>
     <w:tmpl w:val="1EE80C46"/>
@@ -15802,7 +16975,7 @@
       </w:rPr>
     </w:lvl>
   </w:abstractNum>
-  <w:abstractNum w:abstractNumId="10" w15:restartNumberingAfterBreak="0">
+  <w:abstractNum w:abstractNumId="12" w15:restartNumberingAfterBreak="0">
     <w:nsid w:val="0FB70F4F"/>
     <w:multiLevelType w:val="multilevel"/>
     <w:tmpl w:val="D8583AE2"/>
@@ -15951,7 +17124,120 @@
       </w:rPr>
     </w:lvl>
   </w:abstractNum>
-  <w:abstractNum w:abstractNumId="11" w15:restartNumberingAfterBreak="0">
+  <w:abstractNum w:abstractNumId="13" w15:restartNumberingAfterBreak="0">
+    <w:nsid w:val="10762680"/>
+    <w:multiLevelType w:val="multilevel"/>
+    <w:tmpl w:val="717622B0"/>
+    <w:lvl w:ilvl="0">
+      <w:start w:val="1"/>
+      <w:numFmt w:val="decimal"/>
+      <w:lvlText w:val="%1."/>
+      <w:lvlJc w:val="left"/>
+      <w:pPr>
+        <w:tabs>
+          <w:tab w:val="num" w:pos="720"/>
+        </w:tabs>
+        <w:ind w:left="720" w:hanging="360"/>
+      </w:pPr>
+    </w:lvl>
+    <w:lvl w:ilvl="1" w:tentative="1">
+      <w:start w:val="1"/>
+      <w:numFmt w:val="decimal"/>
+      <w:lvlText w:val="%2."/>
+      <w:lvlJc w:val="left"/>
+      <w:pPr>
+        <w:tabs>
+          <w:tab w:val="num" w:pos="1440"/>
+        </w:tabs>
+        <w:ind w:left="1440" w:hanging="360"/>
+      </w:pPr>
+    </w:lvl>
+    <w:lvl w:ilvl="2" w:tentative="1">
+      <w:start w:val="1"/>
+      <w:numFmt w:val="decimal"/>
+      <w:lvlText w:val="%3."/>
+      <w:lvlJc w:val="left"/>
+      <w:pPr>
+        <w:tabs>
+          <w:tab w:val="num" w:pos="2160"/>
+        </w:tabs>
+        <w:ind w:left="2160" w:hanging="360"/>
+      </w:pPr>
+    </w:lvl>
+    <w:lvl w:ilvl="3" w:tentative="1">
+      <w:start w:val="1"/>
+      <w:numFmt w:val="decimal"/>
+      <w:lvlText w:val="%4."/>
+      <w:lvlJc w:val="left"/>
+      <w:pPr>
+        <w:tabs>
+          <w:tab w:val="num" w:pos="2880"/>
+        </w:tabs>
+        <w:ind w:left="2880" w:hanging="360"/>
+      </w:pPr>
+    </w:lvl>
+    <w:lvl w:ilvl="4" w:tentative="1">
+      <w:start w:val="1"/>
+      <w:numFmt w:val="decimal"/>
+      <w:lvlText w:val="%5."/>
+      <w:lvlJc w:val="left"/>
+      <w:pPr>
+        <w:tabs>
+          <w:tab w:val="num" w:pos="3600"/>
+        </w:tabs>
+        <w:ind w:left="3600" w:hanging="360"/>
+      </w:pPr>
+    </w:lvl>
+    <w:lvl w:ilvl="5" w:tentative="1">
+      <w:start w:val="1"/>
+      <w:numFmt w:val="decimal"/>
+      <w:lvlText w:val="%6."/>
+      <w:lvlJc w:val="left"/>
+      <w:pPr>
+        <w:tabs>
+          <w:tab w:val="num" w:pos="4320"/>
+        </w:tabs>
+        <w:ind w:left="4320" w:hanging="360"/>
+      </w:pPr>
+    </w:lvl>
+    <w:lvl w:ilvl="6" w:tentative="1">
+      <w:start w:val="1"/>
+      <w:numFmt w:val="decimal"/>
+      <w:lvlText w:val="%7."/>
+      <w:lvlJc w:val="left"/>
+      <w:pPr>
+        <w:tabs>
+          <w:tab w:val="num" w:pos="5040"/>
+        </w:tabs>
+        <w:ind w:left="5040" w:hanging="360"/>
+      </w:pPr>
+    </w:lvl>
+    <w:lvl w:ilvl="7" w:tentative="1">
+      <w:start w:val="1"/>
+      <w:numFmt w:val="decimal"/>
+      <w:lvlText w:val="%8."/>
+      <w:lvlJc w:val="left"/>
+      <w:pPr>
+        <w:tabs>
+          <w:tab w:val="num" w:pos="5760"/>
+        </w:tabs>
+        <w:ind w:left="5760" w:hanging="360"/>
+      </w:pPr>
+    </w:lvl>
+    <w:lvl w:ilvl="8" w:tentative="1">
+      <w:start w:val="1"/>
+      <w:numFmt w:val="decimal"/>
+      <w:lvlText w:val="%9."/>
+      <w:lvlJc w:val="left"/>
+      <w:pPr>
+        <w:tabs>
+          <w:tab w:val="num" w:pos="6480"/>
+        </w:tabs>
+        <w:ind w:left="6480" w:hanging="360"/>
+      </w:pPr>
+    </w:lvl>
+  </w:abstractNum>
+  <w:abstractNum w:abstractNumId="14" w15:restartNumberingAfterBreak="0">
     <w:nsid w:val="10C924B3"/>
     <w:multiLevelType w:val="multilevel"/>
     <w:tmpl w:val="26B2C214"/>
@@ -16100,7 +17386,7 @@
       </w:rPr>
     </w:lvl>
   </w:abstractNum>
-  <w:abstractNum w:abstractNumId="12" w15:restartNumberingAfterBreak="0">
+  <w:abstractNum w:abstractNumId="15" w15:restartNumberingAfterBreak="0">
     <w:nsid w:val="12E75C04"/>
     <w:multiLevelType w:val="multilevel"/>
     <w:tmpl w:val="806C4350"/>
@@ -16245,7 +17531,7 @@
       </w:rPr>
     </w:lvl>
   </w:abstractNum>
-  <w:abstractNum w:abstractNumId="13" w15:restartNumberingAfterBreak="0">
+  <w:abstractNum w:abstractNumId="16" w15:restartNumberingAfterBreak="0">
     <w:nsid w:val="13932941"/>
     <w:multiLevelType w:val="multilevel"/>
     <w:tmpl w:val="B560B844"/>
@@ -16358,7 +17644,7 @@
       </w:pPr>
     </w:lvl>
   </w:abstractNum>
-  <w:abstractNum w:abstractNumId="14" w15:restartNumberingAfterBreak="0">
+  <w:abstractNum w:abstractNumId="17" w15:restartNumberingAfterBreak="0">
     <w:nsid w:val="1602008C"/>
     <w:multiLevelType w:val="multilevel"/>
     <w:tmpl w:val="4F4EEB6A"/>
@@ -16507,7 +17793,7 @@
       </w:rPr>
     </w:lvl>
   </w:abstractNum>
-  <w:abstractNum w:abstractNumId="15" w15:restartNumberingAfterBreak="0">
+  <w:abstractNum w:abstractNumId="18" w15:restartNumberingAfterBreak="0">
     <w:nsid w:val="16CB2389"/>
     <w:multiLevelType w:val="multilevel"/>
     <w:tmpl w:val="CFAC72B8"/>
@@ -16620,7 +17906,7 @@
       </w:pPr>
     </w:lvl>
   </w:abstractNum>
-  <w:abstractNum w:abstractNumId="16" w15:restartNumberingAfterBreak="0">
+  <w:abstractNum w:abstractNumId="19" w15:restartNumberingAfterBreak="0">
     <w:nsid w:val="17C62C2B"/>
     <w:multiLevelType w:val="multilevel"/>
     <w:tmpl w:val="4F96ABD8"/>
@@ -16733,7 +18019,7 @@
       </w:pPr>
     </w:lvl>
   </w:abstractNum>
-  <w:abstractNum w:abstractNumId="17" w15:restartNumberingAfterBreak="0">
+  <w:abstractNum w:abstractNumId="20" w15:restartNumberingAfterBreak="0">
     <w:nsid w:val="18AA7593"/>
     <w:multiLevelType w:val="multilevel"/>
     <w:tmpl w:val="9C84E954"/>
@@ -16846,7 +18132,7 @@
       </w:pPr>
     </w:lvl>
   </w:abstractNum>
-  <w:abstractNum w:abstractNumId="18" w15:restartNumberingAfterBreak="0">
+  <w:abstractNum w:abstractNumId="21" w15:restartNumberingAfterBreak="0">
     <w:nsid w:val="19CA21BF"/>
     <w:multiLevelType w:val="multilevel"/>
     <w:tmpl w:val="97D0930C"/>
@@ -16995,7 +18281,7 @@
       </w:rPr>
     </w:lvl>
   </w:abstractNum>
-  <w:abstractNum w:abstractNumId="19" w15:restartNumberingAfterBreak="0">
+  <w:abstractNum w:abstractNumId="22" w15:restartNumberingAfterBreak="0">
     <w:nsid w:val="1A223B26"/>
     <w:multiLevelType w:val="multilevel"/>
     <w:tmpl w:val="B40E1430"/>
@@ -17144,7 +18430,7 @@
       </w:rPr>
     </w:lvl>
   </w:abstractNum>
-  <w:abstractNum w:abstractNumId="20" w15:restartNumberingAfterBreak="0">
+  <w:abstractNum w:abstractNumId="23" w15:restartNumberingAfterBreak="0">
     <w:nsid w:val="1AF72D51"/>
     <w:multiLevelType w:val="multilevel"/>
     <w:tmpl w:val="7BCCB972"/>
@@ -17257,7 +18543,7 @@
       </w:pPr>
     </w:lvl>
   </w:abstractNum>
-  <w:abstractNum w:abstractNumId="21" w15:restartNumberingAfterBreak="0">
+  <w:abstractNum w:abstractNumId="24" w15:restartNumberingAfterBreak="0">
     <w:nsid w:val="1BB22119"/>
     <w:multiLevelType w:val="multilevel"/>
     <w:tmpl w:val="60FE4D9C"/>
@@ -17402,7 +18688,120 @@
       </w:rPr>
     </w:lvl>
   </w:abstractNum>
-  <w:abstractNum w:abstractNumId="22" w15:restartNumberingAfterBreak="0">
+  <w:abstractNum w:abstractNumId="25" w15:restartNumberingAfterBreak="0">
+    <w:nsid w:val="1C983A13"/>
+    <w:multiLevelType w:val="multilevel"/>
+    <w:tmpl w:val="717622B0"/>
+    <w:lvl w:ilvl="0">
+      <w:start w:val="1"/>
+      <w:numFmt w:val="decimal"/>
+      <w:lvlText w:val="%1."/>
+      <w:lvlJc w:val="left"/>
+      <w:pPr>
+        <w:tabs>
+          <w:tab w:val="num" w:pos="720"/>
+        </w:tabs>
+        <w:ind w:left="720" w:hanging="360"/>
+      </w:pPr>
+    </w:lvl>
+    <w:lvl w:ilvl="1" w:tentative="1">
+      <w:start w:val="1"/>
+      <w:numFmt w:val="decimal"/>
+      <w:lvlText w:val="%2."/>
+      <w:lvlJc w:val="left"/>
+      <w:pPr>
+        <w:tabs>
+          <w:tab w:val="num" w:pos="1440"/>
+        </w:tabs>
+        <w:ind w:left="1440" w:hanging="360"/>
+      </w:pPr>
+    </w:lvl>
+    <w:lvl w:ilvl="2" w:tentative="1">
+      <w:start w:val="1"/>
+      <w:numFmt w:val="decimal"/>
+      <w:lvlText w:val="%3."/>
+      <w:lvlJc w:val="left"/>
+      <w:pPr>
+        <w:tabs>
+          <w:tab w:val="num" w:pos="2160"/>
+        </w:tabs>
+        <w:ind w:left="2160" w:hanging="360"/>
+      </w:pPr>
+    </w:lvl>
+    <w:lvl w:ilvl="3" w:tentative="1">
+      <w:start w:val="1"/>
+      <w:numFmt w:val="decimal"/>
+      <w:lvlText w:val="%4."/>
+      <w:lvlJc w:val="left"/>
+      <w:pPr>
+        <w:tabs>
+          <w:tab w:val="num" w:pos="2880"/>
+        </w:tabs>
+        <w:ind w:left="2880" w:hanging="360"/>
+      </w:pPr>
+    </w:lvl>
+    <w:lvl w:ilvl="4" w:tentative="1">
+      <w:start w:val="1"/>
+      <w:numFmt w:val="decimal"/>
+      <w:lvlText w:val="%5."/>
+      <w:lvlJc w:val="left"/>
+      <w:pPr>
+        <w:tabs>
+          <w:tab w:val="num" w:pos="3600"/>
+        </w:tabs>
+        <w:ind w:left="3600" w:hanging="360"/>
+      </w:pPr>
+    </w:lvl>
+    <w:lvl w:ilvl="5" w:tentative="1">
+      <w:start w:val="1"/>
+      <w:numFmt w:val="decimal"/>
+      <w:lvlText w:val="%6."/>
+      <w:lvlJc w:val="left"/>
+      <w:pPr>
+        <w:tabs>
+          <w:tab w:val="num" w:pos="4320"/>
+        </w:tabs>
+        <w:ind w:left="4320" w:hanging="360"/>
+      </w:pPr>
+    </w:lvl>
+    <w:lvl w:ilvl="6" w:tentative="1">
+      <w:start w:val="1"/>
+      <w:numFmt w:val="decimal"/>
+      <w:lvlText w:val="%7."/>
+      <w:lvlJc w:val="left"/>
+      <w:pPr>
+        <w:tabs>
+          <w:tab w:val="num" w:pos="5040"/>
+        </w:tabs>
+        <w:ind w:left="5040" w:hanging="360"/>
+      </w:pPr>
+    </w:lvl>
+    <w:lvl w:ilvl="7" w:tentative="1">
+      <w:start w:val="1"/>
+      <w:numFmt w:val="decimal"/>
+      <w:lvlText w:val="%8."/>
+      <w:lvlJc w:val="left"/>
+      <w:pPr>
+        <w:tabs>
+          <w:tab w:val="num" w:pos="5760"/>
+        </w:tabs>
+        <w:ind w:left="5760" w:hanging="360"/>
+      </w:pPr>
+    </w:lvl>
+    <w:lvl w:ilvl="8" w:tentative="1">
+      <w:start w:val="1"/>
+      <w:numFmt w:val="decimal"/>
+      <w:lvlText w:val="%9."/>
+      <w:lvlJc w:val="left"/>
+      <w:pPr>
+        <w:tabs>
+          <w:tab w:val="num" w:pos="6480"/>
+        </w:tabs>
+        <w:ind w:left="6480" w:hanging="360"/>
+      </w:pPr>
+    </w:lvl>
+  </w:abstractNum>
+  <w:abstractNum w:abstractNumId="26" w15:restartNumberingAfterBreak="0">
     <w:nsid w:val="1CB46389"/>
     <w:multiLevelType w:val="multilevel"/>
     <w:tmpl w:val="8DFA5820"/>
@@ -17551,7 +18950,7 @@
       </w:rPr>
     </w:lvl>
   </w:abstractNum>
-  <w:abstractNum w:abstractNumId="23" w15:restartNumberingAfterBreak="0">
+  <w:abstractNum w:abstractNumId="27" w15:restartNumberingAfterBreak="0">
     <w:nsid w:val="1CB75472"/>
     <w:multiLevelType w:val="multilevel"/>
     <w:tmpl w:val="B9F802C4"/>
@@ -17664,7 +19063,7 @@
       </w:pPr>
     </w:lvl>
   </w:abstractNum>
-  <w:abstractNum w:abstractNumId="24" w15:restartNumberingAfterBreak="0">
+  <w:abstractNum w:abstractNumId="28" w15:restartNumberingAfterBreak="0">
     <w:nsid w:val="1EB5409B"/>
     <w:multiLevelType w:val="multilevel"/>
     <w:tmpl w:val="5C98AF5A"/>
@@ -17813,7 +19212,7 @@
       </w:rPr>
     </w:lvl>
   </w:abstractNum>
-  <w:abstractNum w:abstractNumId="25" w15:restartNumberingAfterBreak="0">
+  <w:abstractNum w:abstractNumId="29" w15:restartNumberingAfterBreak="0">
     <w:nsid w:val="1F110C09"/>
     <w:multiLevelType w:val="multilevel"/>
     <w:tmpl w:val="E3CA6E36"/>
@@ -17962,7 +19361,7 @@
       </w:rPr>
     </w:lvl>
   </w:abstractNum>
-  <w:abstractNum w:abstractNumId="26" w15:restartNumberingAfterBreak="0">
+  <w:abstractNum w:abstractNumId="30" w15:restartNumberingAfterBreak="0">
     <w:nsid w:val="208F43F7"/>
     <w:multiLevelType w:val="multilevel"/>
     <w:tmpl w:val="27D8E2F0"/>
@@ -18111,7 +19510,7 @@
       </w:rPr>
     </w:lvl>
   </w:abstractNum>
-  <w:abstractNum w:abstractNumId="27" w15:restartNumberingAfterBreak="0">
+  <w:abstractNum w:abstractNumId="31" w15:restartNumberingAfterBreak="0">
     <w:nsid w:val="240B6A2C"/>
     <w:multiLevelType w:val="multilevel"/>
     <w:tmpl w:val="AC9A1740"/>
@@ -18260,7 +19659,7 @@
       </w:rPr>
     </w:lvl>
   </w:abstractNum>
-  <w:abstractNum w:abstractNumId="28" w15:restartNumberingAfterBreak="0">
+  <w:abstractNum w:abstractNumId="32" w15:restartNumberingAfterBreak="0">
     <w:nsid w:val="253521F6"/>
     <w:multiLevelType w:val="multilevel"/>
     <w:tmpl w:val="20A47FBA"/>
@@ -18373,7 +19772,7 @@
       </w:pPr>
     </w:lvl>
   </w:abstractNum>
-  <w:abstractNum w:abstractNumId="29" w15:restartNumberingAfterBreak="0">
+  <w:abstractNum w:abstractNumId="33" w15:restartNumberingAfterBreak="0">
     <w:nsid w:val="25641CAE"/>
     <w:multiLevelType w:val="multilevel"/>
     <w:tmpl w:val="F65E3AC6"/>
@@ -18486,7 +19885,7 @@
       </w:pPr>
     </w:lvl>
   </w:abstractNum>
-  <w:abstractNum w:abstractNumId="30" w15:restartNumberingAfterBreak="0">
+  <w:abstractNum w:abstractNumId="34" w15:restartNumberingAfterBreak="0">
     <w:nsid w:val="279F2947"/>
     <w:multiLevelType w:val="multilevel"/>
     <w:tmpl w:val="6386901E"/>
@@ -18599,7 +19998,7 @@
       </w:pPr>
     </w:lvl>
   </w:abstractNum>
-  <w:abstractNum w:abstractNumId="31" w15:restartNumberingAfterBreak="0">
+  <w:abstractNum w:abstractNumId="35" w15:restartNumberingAfterBreak="0">
     <w:nsid w:val="27BA384A"/>
     <w:multiLevelType w:val="multilevel"/>
     <w:tmpl w:val="5EF8D430"/>
@@ -18712,7 +20111,7 @@
       </w:pPr>
     </w:lvl>
   </w:abstractNum>
-  <w:abstractNum w:abstractNumId="32" w15:restartNumberingAfterBreak="0">
+  <w:abstractNum w:abstractNumId="36" w15:restartNumberingAfterBreak="0">
     <w:nsid w:val="28DA7723"/>
     <w:multiLevelType w:val="multilevel"/>
     <w:tmpl w:val="B6DE1C46"/>
@@ -18861,7 +20260,7 @@
       </w:rPr>
     </w:lvl>
   </w:abstractNum>
-  <w:abstractNum w:abstractNumId="33" w15:restartNumberingAfterBreak="0">
+  <w:abstractNum w:abstractNumId="37" w15:restartNumberingAfterBreak="0">
     <w:nsid w:val="29CE7CE2"/>
     <w:multiLevelType w:val="multilevel"/>
     <w:tmpl w:val="9CE8118C"/>
@@ -19010,7 +20409,7 @@
       </w:rPr>
     </w:lvl>
   </w:abstractNum>
-  <w:abstractNum w:abstractNumId="34" w15:restartNumberingAfterBreak="0">
+  <w:abstractNum w:abstractNumId="38" w15:restartNumberingAfterBreak="0">
     <w:nsid w:val="2A8A336E"/>
     <w:multiLevelType w:val="multilevel"/>
     <w:tmpl w:val="935C9DA2"/>
@@ -19159,7 +20558,7 @@
       </w:rPr>
     </w:lvl>
   </w:abstractNum>
-  <w:abstractNum w:abstractNumId="35" w15:restartNumberingAfterBreak="0">
+  <w:abstractNum w:abstractNumId="39" w15:restartNumberingAfterBreak="0">
     <w:nsid w:val="2B3420F5"/>
     <w:multiLevelType w:val="multilevel"/>
     <w:tmpl w:val="280A50A0"/>
@@ -19308,7 +20707,7 @@
       </w:rPr>
     </w:lvl>
   </w:abstractNum>
-  <w:abstractNum w:abstractNumId="36" w15:restartNumberingAfterBreak="0">
+  <w:abstractNum w:abstractNumId="40" w15:restartNumberingAfterBreak="0">
     <w:nsid w:val="2B5B07B3"/>
     <w:multiLevelType w:val="multilevel"/>
     <w:tmpl w:val="326CDD36"/>
@@ -19457,7 +20856,7 @@
       </w:rPr>
     </w:lvl>
   </w:abstractNum>
-  <w:abstractNum w:abstractNumId="37" w15:restartNumberingAfterBreak="0">
+  <w:abstractNum w:abstractNumId="41" w15:restartNumberingAfterBreak="0">
     <w:nsid w:val="2B86625A"/>
     <w:multiLevelType w:val="multilevel"/>
     <w:tmpl w:val="D46CC164"/>
@@ -19606,7 +21005,7 @@
       </w:rPr>
     </w:lvl>
   </w:abstractNum>
-  <w:abstractNum w:abstractNumId="38" w15:restartNumberingAfterBreak="0">
+  <w:abstractNum w:abstractNumId="42" w15:restartNumberingAfterBreak="0">
     <w:nsid w:val="2B9B1804"/>
     <w:multiLevelType w:val="multilevel"/>
     <w:tmpl w:val="5866BA0A"/>
@@ -19751,7 +21150,7 @@
       </w:rPr>
     </w:lvl>
   </w:abstractNum>
-  <w:abstractNum w:abstractNumId="39" w15:restartNumberingAfterBreak="0">
+  <w:abstractNum w:abstractNumId="43" w15:restartNumberingAfterBreak="0">
     <w:nsid w:val="2DD90D07"/>
     <w:multiLevelType w:val="multilevel"/>
     <w:tmpl w:val="10726800"/>
@@ -19900,7 +21299,7 @@
       </w:rPr>
     </w:lvl>
   </w:abstractNum>
-  <w:abstractNum w:abstractNumId="40" w15:restartNumberingAfterBreak="0">
+  <w:abstractNum w:abstractNumId="44" w15:restartNumberingAfterBreak="0">
     <w:nsid w:val="330F721A"/>
     <w:multiLevelType w:val="multilevel"/>
     <w:tmpl w:val="378EABBE"/>
@@ -20049,7 +21448,7 @@
       </w:rPr>
     </w:lvl>
   </w:abstractNum>
-  <w:abstractNum w:abstractNumId="41" w15:restartNumberingAfterBreak="0">
+  <w:abstractNum w:abstractNumId="45" w15:restartNumberingAfterBreak="0">
     <w:nsid w:val="347E7C09"/>
     <w:multiLevelType w:val="multilevel"/>
     <w:tmpl w:val="7972790C"/>
@@ -20198,7 +21597,7 @@
       </w:rPr>
     </w:lvl>
   </w:abstractNum>
-  <w:abstractNum w:abstractNumId="42" w15:restartNumberingAfterBreak="0">
+  <w:abstractNum w:abstractNumId="46" w15:restartNumberingAfterBreak="0">
     <w:nsid w:val="37574FA6"/>
     <w:multiLevelType w:val="multilevel"/>
     <w:tmpl w:val="A83EE576"/>
@@ -20347,7 +21746,7 @@
       </w:rPr>
     </w:lvl>
   </w:abstractNum>
-  <w:abstractNum w:abstractNumId="43" w15:restartNumberingAfterBreak="0">
+  <w:abstractNum w:abstractNumId="47" w15:restartNumberingAfterBreak="0">
     <w:nsid w:val="376A28DA"/>
     <w:multiLevelType w:val="multilevel"/>
     <w:tmpl w:val="D0EEE99E"/>
@@ -20496,7 +21895,7 @@
       </w:rPr>
     </w:lvl>
   </w:abstractNum>
-  <w:abstractNum w:abstractNumId="44" w15:restartNumberingAfterBreak="0">
+  <w:abstractNum w:abstractNumId="48" w15:restartNumberingAfterBreak="0">
     <w:nsid w:val="37E16113"/>
     <w:multiLevelType w:val="multilevel"/>
     <w:tmpl w:val="DE76DD34"/>
@@ -20645,7 +22044,7 @@
       </w:rPr>
     </w:lvl>
   </w:abstractNum>
-  <w:abstractNum w:abstractNumId="45" w15:restartNumberingAfterBreak="0">
+  <w:abstractNum w:abstractNumId="49" w15:restartNumberingAfterBreak="0">
     <w:nsid w:val="386B1DBE"/>
     <w:multiLevelType w:val="multilevel"/>
     <w:tmpl w:val="767AC314"/>
@@ -20758,7 +22157,7 @@
       </w:pPr>
     </w:lvl>
   </w:abstractNum>
-  <w:abstractNum w:abstractNumId="46" w15:restartNumberingAfterBreak="0">
+  <w:abstractNum w:abstractNumId="50" w15:restartNumberingAfterBreak="0">
     <w:nsid w:val="38CC2CC7"/>
     <w:multiLevelType w:val="multilevel"/>
     <w:tmpl w:val="EF60D922"/>
@@ -20871,7 +22270,7 @@
       </w:pPr>
     </w:lvl>
   </w:abstractNum>
-  <w:abstractNum w:abstractNumId="47" w15:restartNumberingAfterBreak="0">
+  <w:abstractNum w:abstractNumId="51" w15:restartNumberingAfterBreak="0">
     <w:nsid w:val="38ED0F68"/>
     <w:multiLevelType w:val="multilevel"/>
     <w:tmpl w:val="84482972"/>
@@ -20984,7 +22383,7 @@
       </w:pPr>
     </w:lvl>
   </w:abstractNum>
-  <w:abstractNum w:abstractNumId="48" w15:restartNumberingAfterBreak="0">
+  <w:abstractNum w:abstractNumId="52" w15:restartNumberingAfterBreak="0">
     <w:nsid w:val="3ADE11E3"/>
     <w:multiLevelType w:val="multilevel"/>
     <w:tmpl w:val="D146EEDE"/>
@@ -21097,7 +22496,7 @@
       </w:pPr>
     </w:lvl>
   </w:abstractNum>
-  <w:abstractNum w:abstractNumId="49" w15:restartNumberingAfterBreak="0">
+  <w:abstractNum w:abstractNumId="53" w15:restartNumberingAfterBreak="0">
     <w:nsid w:val="3B3D562E"/>
     <w:multiLevelType w:val="multilevel"/>
     <w:tmpl w:val="F85EF790"/>
@@ -21210,7 +22609,7 @@
       </w:pPr>
     </w:lvl>
   </w:abstractNum>
-  <w:abstractNum w:abstractNumId="50" w15:restartNumberingAfterBreak="0">
+  <w:abstractNum w:abstractNumId="54" w15:restartNumberingAfterBreak="0">
     <w:nsid w:val="3BAC784C"/>
     <w:multiLevelType w:val="multilevel"/>
     <w:tmpl w:val="9382678E"/>
@@ -21359,7 +22758,7 @@
       </w:rPr>
     </w:lvl>
   </w:abstractNum>
-  <w:abstractNum w:abstractNumId="51" w15:restartNumberingAfterBreak="0">
+  <w:abstractNum w:abstractNumId="55" w15:restartNumberingAfterBreak="0">
     <w:nsid w:val="3CA96E09"/>
     <w:multiLevelType w:val="multilevel"/>
     <w:tmpl w:val="56D0F33A"/>
@@ -21472,7 +22871,7 @@
       </w:pPr>
     </w:lvl>
   </w:abstractNum>
-  <w:abstractNum w:abstractNumId="52" w15:restartNumberingAfterBreak="0">
+  <w:abstractNum w:abstractNumId="56" w15:restartNumberingAfterBreak="0">
     <w:nsid w:val="3CC75BEE"/>
     <w:multiLevelType w:val="multilevel"/>
     <w:tmpl w:val="21481F66"/>
@@ -21621,7 +23020,7 @@
       </w:rPr>
     </w:lvl>
   </w:abstractNum>
-  <w:abstractNum w:abstractNumId="53" w15:restartNumberingAfterBreak="0">
+  <w:abstractNum w:abstractNumId="57" w15:restartNumberingAfterBreak="0">
     <w:nsid w:val="3D6B682C"/>
     <w:multiLevelType w:val="multilevel"/>
     <w:tmpl w:val="5540F590"/>
@@ -21770,7 +23169,120 @@
       </w:rPr>
     </w:lvl>
   </w:abstractNum>
-  <w:abstractNum w:abstractNumId="54" w15:restartNumberingAfterBreak="0">
+  <w:abstractNum w:abstractNumId="58" w15:restartNumberingAfterBreak="0">
+    <w:nsid w:val="3DDC663E"/>
+    <w:multiLevelType w:val="multilevel"/>
+    <w:tmpl w:val="717622B0"/>
+    <w:lvl w:ilvl="0">
+      <w:start w:val="1"/>
+      <w:numFmt w:val="decimal"/>
+      <w:lvlText w:val="%1."/>
+      <w:lvlJc w:val="left"/>
+      <w:pPr>
+        <w:tabs>
+          <w:tab w:val="num" w:pos="720"/>
+        </w:tabs>
+        <w:ind w:left="720" w:hanging="360"/>
+      </w:pPr>
+    </w:lvl>
+    <w:lvl w:ilvl="1" w:tentative="1">
+      <w:start w:val="1"/>
+      <w:numFmt w:val="decimal"/>
+      <w:lvlText w:val="%2."/>
+      <w:lvlJc w:val="left"/>
+      <w:pPr>
+        <w:tabs>
+          <w:tab w:val="num" w:pos="1440"/>
+        </w:tabs>
+        <w:ind w:left="1440" w:hanging="360"/>
+      </w:pPr>
+    </w:lvl>
+    <w:lvl w:ilvl="2" w:tentative="1">
+      <w:start w:val="1"/>
+      <w:numFmt w:val="decimal"/>
+      <w:lvlText w:val="%3."/>
+      <w:lvlJc w:val="left"/>
+      <w:pPr>
+        <w:tabs>
+          <w:tab w:val="num" w:pos="2160"/>
+        </w:tabs>
+        <w:ind w:left="2160" w:hanging="360"/>
+      </w:pPr>
+    </w:lvl>
+    <w:lvl w:ilvl="3" w:tentative="1">
+      <w:start w:val="1"/>
+      <w:numFmt w:val="decimal"/>
+      <w:lvlText w:val="%4."/>
+      <w:lvlJc w:val="left"/>
+      <w:pPr>
+        <w:tabs>
+          <w:tab w:val="num" w:pos="2880"/>
+        </w:tabs>
+        <w:ind w:left="2880" w:hanging="360"/>
+      </w:pPr>
+    </w:lvl>
+    <w:lvl w:ilvl="4" w:tentative="1">
+      <w:start w:val="1"/>
+      <w:numFmt w:val="decimal"/>
+      <w:lvlText w:val="%5."/>
+      <w:lvlJc w:val="left"/>
+      <w:pPr>
+        <w:tabs>
+          <w:tab w:val="num" w:pos="3600"/>
+        </w:tabs>
+        <w:ind w:left="3600" w:hanging="360"/>
+      </w:pPr>
+    </w:lvl>
+    <w:lvl w:ilvl="5" w:tentative="1">
+      <w:start w:val="1"/>
+      <w:numFmt w:val="decimal"/>
+      <w:lvlText w:val="%6."/>
+      <w:lvlJc w:val="left"/>
+      <w:pPr>
+        <w:tabs>
+          <w:tab w:val="num" w:pos="4320"/>
+        </w:tabs>
+        <w:ind w:left="4320" w:hanging="360"/>
+      </w:pPr>
+    </w:lvl>
+    <w:lvl w:ilvl="6" w:tentative="1">
+      <w:start w:val="1"/>
+      <w:numFmt w:val="decimal"/>
+      <w:lvlText w:val="%7."/>
+      <w:lvlJc w:val="left"/>
+      <w:pPr>
+        <w:tabs>
+          <w:tab w:val="num" w:pos="5040"/>
+        </w:tabs>
+        <w:ind w:left="5040" w:hanging="360"/>
+      </w:pPr>
+    </w:lvl>
+    <w:lvl w:ilvl="7" w:tentative="1">
+      <w:start w:val="1"/>
+      <w:numFmt w:val="decimal"/>
+      <w:lvlText w:val="%8."/>
+      <w:lvlJc w:val="left"/>
+      <w:pPr>
+        <w:tabs>
+          <w:tab w:val="num" w:pos="5760"/>
+        </w:tabs>
+        <w:ind w:left="5760" w:hanging="360"/>
+      </w:pPr>
+    </w:lvl>
+    <w:lvl w:ilvl="8" w:tentative="1">
+      <w:start w:val="1"/>
+      <w:numFmt w:val="decimal"/>
+      <w:lvlText w:val="%9."/>
+      <w:lvlJc w:val="left"/>
+      <w:pPr>
+        <w:tabs>
+          <w:tab w:val="num" w:pos="6480"/>
+        </w:tabs>
+        <w:ind w:left="6480" w:hanging="360"/>
+      </w:pPr>
+    </w:lvl>
+  </w:abstractNum>
+  <w:abstractNum w:abstractNumId="59" w15:restartNumberingAfterBreak="0">
     <w:nsid w:val="3E335B58"/>
     <w:multiLevelType w:val="multilevel"/>
     <w:tmpl w:val="10DC39C6"/>
@@ -21919,7 +23431,7 @@
       </w:rPr>
     </w:lvl>
   </w:abstractNum>
-  <w:abstractNum w:abstractNumId="55" w15:restartNumberingAfterBreak="0">
+  <w:abstractNum w:abstractNumId="60" w15:restartNumberingAfterBreak="0">
     <w:nsid w:val="3E3E0E6F"/>
     <w:multiLevelType w:val="multilevel"/>
     <w:tmpl w:val="D11465C0"/>
@@ -22068,7 +23580,7 @@
       </w:rPr>
     </w:lvl>
   </w:abstractNum>
-  <w:abstractNum w:abstractNumId="56" w15:restartNumberingAfterBreak="0">
+  <w:abstractNum w:abstractNumId="61" w15:restartNumberingAfterBreak="0">
     <w:nsid w:val="41E52897"/>
     <w:multiLevelType w:val="multilevel"/>
     <w:tmpl w:val="B8725F76"/>
@@ -22181,7 +23693,120 @@
       </w:pPr>
     </w:lvl>
   </w:abstractNum>
-  <w:abstractNum w:abstractNumId="57" w15:restartNumberingAfterBreak="0">
+  <w:abstractNum w:abstractNumId="62" w15:restartNumberingAfterBreak="0">
+    <w:nsid w:val="42FA215B"/>
+    <w:multiLevelType w:val="multilevel"/>
+    <w:tmpl w:val="717622B0"/>
+    <w:lvl w:ilvl="0">
+      <w:start w:val="1"/>
+      <w:numFmt w:val="decimal"/>
+      <w:lvlText w:val="%1."/>
+      <w:lvlJc w:val="left"/>
+      <w:pPr>
+        <w:tabs>
+          <w:tab w:val="num" w:pos="720"/>
+        </w:tabs>
+        <w:ind w:left="720" w:hanging="360"/>
+      </w:pPr>
+    </w:lvl>
+    <w:lvl w:ilvl="1" w:tentative="1">
+      <w:start w:val="1"/>
+      <w:numFmt w:val="decimal"/>
+      <w:lvlText w:val="%2."/>
+      <w:lvlJc w:val="left"/>
+      <w:pPr>
+        <w:tabs>
+          <w:tab w:val="num" w:pos="1440"/>
+        </w:tabs>
+        <w:ind w:left="1440" w:hanging="360"/>
+      </w:pPr>
+    </w:lvl>
+    <w:lvl w:ilvl="2" w:tentative="1">
+      <w:start w:val="1"/>
+      <w:numFmt w:val="decimal"/>
+      <w:lvlText w:val="%3."/>
+      <w:lvlJc w:val="left"/>
+      <w:pPr>
+        <w:tabs>
+          <w:tab w:val="num" w:pos="2160"/>
+        </w:tabs>
+        <w:ind w:left="2160" w:hanging="360"/>
+      </w:pPr>
+    </w:lvl>
+    <w:lvl w:ilvl="3" w:tentative="1">
+      <w:start w:val="1"/>
+      <w:numFmt w:val="decimal"/>
+      <w:lvlText w:val="%4."/>
+      <w:lvlJc w:val="left"/>
+      <w:pPr>
+        <w:tabs>
+          <w:tab w:val="num" w:pos="2880"/>
+        </w:tabs>
+        <w:ind w:left="2880" w:hanging="360"/>
+      </w:pPr>
+    </w:lvl>
+    <w:lvl w:ilvl="4" w:tentative="1">
+      <w:start w:val="1"/>
+      <w:numFmt w:val="decimal"/>
+      <w:lvlText w:val="%5."/>
+      <w:lvlJc w:val="left"/>
+      <w:pPr>
+        <w:tabs>
+          <w:tab w:val="num" w:pos="3600"/>
+        </w:tabs>
+        <w:ind w:left="3600" w:hanging="360"/>
+      </w:pPr>
+    </w:lvl>
+    <w:lvl w:ilvl="5" w:tentative="1">
+      <w:start w:val="1"/>
+      <w:numFmt w:val="decimal"/>
+      <w:lvlText w:val="%6."/>
+      <w:lvlJc w:val="left"/>
+      <w:pPr>
+        <w:tabs>
+          <w:tab w:val="num" w:pos="4320"/>
+        </w:tabs>
+        <w:ind w:left="4320" w:hanging="360"/>
+      </w:pPr>
+    </w:lvl>
+    <w:lvl w:ilvl="6" w:tentative="1">
+      <w:start w:val="1"/>
+      <w:numFmt w:val="decimal"/>
+      <w:lvlText w:val="%7."/>
+      <w:lvlJc w:val="left"/>
+      <w:pPr>
+        <w:tabs>
+          <w:tab w:val="num" w:pos="5040"/>
+        </w:tabs>
+        <w:ind w:left="5040" w:hanging="360"/>
+      </w:pPr>
+    </w:lvl>
+    <w:lvl w:ilvl="7" w:tentative="1">
+      <w:start w:val="1"/>
+      <w:numFmt w:val="decimal"/>
+      <w:lvlText w:val="%8."/>
+      <w:lvlJc w:val="left"/>
+      <w:pPr>
+        <w:tabs>
+          <w:tab w:val="num" w:pos="5760"/>
+        </w:tabs>
+        <w:ind w:left="5760" w:hanging="360"/>
+      </w:pPr>
+    </w:lvl>
+    <w:lvl w:ilvl="8" w:tentative="1">
+      <w:start w:val="1"/>
+      <w:numFmt w:val="decimal"/>
+      <w:lvlText w:val="%9."/>
+      <w:lvlJc w:val="left"/>
+      <w:pPr>
+        <w:tabs>
+          <w:tab w:val="num" w:pos="6480"/>
+        </w:tabs>
+        <w:ind w:left="6480" w:hanging="360"/>
+      </w:pPr>
+    </w:lvl>
+  </w:abstractNum>
+  <w:abstractNum w:abstractNumId="63" w15:restartNumberingAfterBreak="0">
     <w:nsid w:val="45020F0C"/>
     <w:multiLevelType w:val="multilevel"/>
     <w:tmpl w:val="D688B6C4"/>
@@ -22294,7 +23919,7 @@
       </w:pPr>
     </w:lvl>
   </w:abstractNum>
-  <w:abstractNum w:abstractNumId="58" w15:restartNumberingAfterBreak="0">
+  <w:abstractNum w:abstractNumId="64" w15:restartNumberingAfterBreak="0">
     <w:nsid w:val="45200D9F"/>
     <w:multiLevelType w:val="multilevel"/>
     <w:tmpl w:val="768EAFB8"/>
@@ -22443,7 +24068,7 @@
       </w:rPr>
     </w:lvl>
   </w:abstractNum>
-  <w:abstractNum w:abstractNumId="59" w15:restartNumberingAfterBreak="0">
+  <w:abstractNum w:abstractNumId="65" w15:restartNumberingAfterBreak="0">
     <w:nsid w:val="466F5315"/>
     <w:multiLevelType w:val="multilevel"/>
     <w:tmpl w:val="398E7464"/>
@@ -22592,7 +24217,7 @@
       </w:rPr>
     </w:lvl>
   </w:abstractNum>
-  <w:abstractNum w:abstractNumId="60" w15:restartNumberingAfterBreak="0">
+  <w:abstractNum w:abstractNumId="66" w15:restartNumberingAfterBreak="0">
     <w:nsid w:val="49144418"/>
     <w:multiLevelType w:val="multilevel"/>
     <w:tmpl w:val="22BE5F10"/>
@@ -22705,7 +24330,7 @@
       </w:pPr>
     </w:lvl>
   </w:abstractNum>
-  <w:abstractNum w:abstractNumId="61" w15:restartNumberingAfterBreak="0">
+  <w:abstractNum w:abstractNumId="67" w15:restartNumberingAfterBreak="0">
     <w:nsid w:val="4921366B"/>
     <w:multiLevelType w:val="multilevel"/>
     <w:tmpl w:val="C8026EB8"/>
@@ -22854,7 +24479,7 @@
       </w:rPr>
     </w:lvl>
   </w:abstractNum>
-  <w:abstractNum w:abstractNumId="62" w15:restartNumberingAfterBreak="0">
+  <w:abstractNum w:abstractNumId="68" w15:restartNumberingAfterBreak="0">
     <w:nsid w:val="4A9029A0"/>
     <w:multiLevelType w:val="multilevel"/>
     <w:tmpl w:val="3C90E960"/>
@@ -23003,7 +24628,7 @@
       </w:rPr>
     </w:lvl>
   </w:abstractNum>
-  <w:abstractNum w:abstractNumId="63" w15:restartNumberingAfterBreak="0">
+  <w:abstractNum w:abstractNumId="69" w15:restartNumberingAfterBreak="0">
     <w:nsid w:val="4D922B09"/>
     <w:multiLevelType w:val="multilevel"/>
     <w:tmpl w:val="8252146C"/>
@@ -23152,7 +24777,7 @@
       </w:rPr>
     </w:lvl>
   </w:abstractNum>
-  <w:abstractNum w:abstractNumId="64" w15:restartNumberingAfterBreak="0">
+  <w:abstractNum w:abstractNumId="70" w15:restartNumberingAfterBreak="0">
     <w:nsid w:val="4ED63451"/>
     <w:multiLevelType w:val="multilevel"/>
     <w:tmpl w:val="7290A134"/>
@@ -23301,7 +24926,7 @@
       </w:rPr>
     </w:lvl>
   </w:abstractNum>
-  <w:abstractNum w:abstractNumId="65" w15:restartNumberingAfterBreak="0">
+  <w:abstractNum w:abstractNumId="71" w15:restartNumberingAfterBreak="0">
     <w:nsid w:val="4F97188C"/>
     <w:multiLevelType w:val="multilevel"/>
     <w:tmpl w:val="B89A6D40"/>
@@ -23450,7 +25075,7 @@
       </w:rPr>
     </w:lvl>
   </w:abstractNum>
-  <w:abstractNum w:abstractNumId="66" w15:restartNumberingAfterBreak="0">
+  <w:abstractNum w:abstractNumId="72" w15:restartNumberingAfterBreak="0">
     <w:nsid w:val="4FA65DFC"/>
     <w:multiLevelType w:val="multilevel"/>
     <w:tmpl w:val="99EA3BB4"/>
@@ -23599,7 +25224,7 @@
       </w:rPr>
     </w:lvl>
   </w:abstractNum>
-  <w:abstractNum w:abstractNumId="67" w15:restartNumberingAfterBreak="0">
+  <w:abstractNum w:abstractNumId="73" w15:restartNumberingAfterBreak="0">
     <w:nsid w:val="4FB47787"/>
     <w:multiLevelType w:val="multilevel"/>
     <w:tmpl w:val="9E3E2584"/>
@@ -23712,7 +25337,7 @@
       </w:pPr>
     </w:lvl>
   </w:abstractNum>
-  <w:abstractNum w:abstractNumId="68" w15:restartNumberingAfterBreak="0">
+  <w:abstractNum w:abstractNumId="74" w15:restartNumberingAfterBreak="0">
     <w:nsid w:val="50244E21"/>
     <w:multiLevelType w:val="multilevel"/>
     <w:tmpl w:val="0AFE1D4E"/>
@@ -23825,7 +25450,7 @@
       </w:pPr>
     </w:lvl>
   </w:abstractNum>
-  <w:abstractNum w:abstractNumId="69" w15:restartNumberingAfterBreak="0">
+  <w:abstractNum w:abstractNumId="75" w15:restartNumberingAfterBreak="0">
     <w:nsid w:val="50A169E7"/>
     <w:multiLevelType w:val="multilevel"/>
     <w:tmpl w:val="38E2C3B2"/>
@@ -23938,7 +25563,7 @@
       </w:pPr>
     </w:lvl>
   </w:abstractNum>
-  <w:abstractNum w:abstractNumId="70" w15:restartNumberingAfterBreak="0">
+  <w:abstractNum w:abstractNumId="76" w15:restartNumberingAfterBreak="0">
     <w:nsid w:val="54190045"/>
     <w:multiLevelType w:val="multilevel"/>
     <w:tmpl w:val="FF32E9A6"/>
@@ -24051,7 +25676,7 @@
       </w:pPr>
     </w:lvl>
   </w:abstractNum>
-  <w:abstractNum w:abstractNumId="71" w15:restartNumberingAfterBreak="0">
+  <w:abstractNum w:abstractNumId="77" w15:restartNumberingAfterBreak="0">
     <w:nsid w:val="557B17F9"/>
     <w:multiLevelType w:val="multilevel"/>
     <w:tmpl w:val="DE6A1736"/>
@@ -24164,7 +25789,120 @@
       </w:pPr>
     </w:lvl>
   </w:abstractNum>
-  <w:abstractNum w:abstractNumId="72" w15:restartNumberingAfterBreak="0">
+  <w:abstractNum w:abstractNumId="78" w15:restartNumberingAfterBreak="0">
+    <w:nsid w:val="56826FAE"/>
+    <w:multiLevelType w:val="multilevel"/>
+    <w:tmpl w:val="717622B0"/>
+    <w:lvl w:ilvl="0">
+      <w:start w:val="1"/>
+      <w:numFmt w:val="decimal"/>
+      <w:lvlText w:val="%1."/>
+      <w:lvlJc w:val="left"/>
+      <w:pPr>
+        <w:tabs>
+          <w:tab w:val="num" w:pos="720"/>
+        </w:tabs>
+        <w:ind w:left="720" w:hanging="360"/>
+      </w:pPr>
+    </w:lvl>
+    <w:lvl w:ilvl="1" w:tentative="1">
+      <w:start w:val="1"/>
+      <w:numFmt w:val="decimal"/>
+      <w:lvlText w:val="%2."/>
+      <w:lvlJc w:val="left"/>
+      <w:pPr>
+        <w:tabs>
+          <w:tab w:val="num" w:pos="1440"/>
+        </w:tabs>
+        <w:ind w:left="1440" w:hanging="360"/>
+      </w:pPr>
+    </w:lvl>
+    <w:lvl w:ilvl="2" w:tentative="1">
+      <w:start w:val="1"/>
+      <w:numFmt w:val="decimal"/>
+      <w:lvlText w:val="%3."/>
+      <w:lvlJc w:val="left"/>
+      <w:pPr>
+        <w:tabs>
+          <w:tab w:val="num" w:pos="2160"/>
+        </w:tabs>
+        <w:ind w:left="2160" w:hanging="360"/>
+      </w:pPr>
+    </w:lvl>
+    <w:lvl w:ilvl="3" w:tentative="1">
+      <w:start w:val="1"/>
+      <w:numFmt w:val="decimal"/>
+      <w:lvlText w:val="%4."/>
+      <w:lvlJc w:val="left"/>
+      <w:pPr>
+        <w:tabs>
+          <w:tab w:val="num" w:pos="2880"/>
+        </w:tabs>
+        <w:ind w:left="2880" w:hanging="360"/>
+      </w:pPr>
+    </w:lvl>
+    <w:lvl w:ilvl="4" w:tentative="1">
+      <w:start w:val="1"/>
+      <w:numFmt w:val="decimal"/>
+      <w:lvlText w:val="%5."/>
+      <w:lvlJc w:val="left"/>
+      <w:pPr>
+        <w:tabs>
+          <w:tab w:val="num" w:pos="3600"/>
+        </w:tabs>
+        <w:ind w:left="3600" w:hanging="360"/>
+      </w:pPr>
+    </w:lvl>
+    <w:lvl w:ilvl="5" w:tentative="1">
+      <w:start w:val="1"/>
+      <w:numFmt w:val="decimal"/>
+      <w:lvlText w:val="%6."/>
+      <w:lvlJc w:val="left"/>
+      <w:pPr>
+        <w:tabs>
+          <w:tab w:val="num" w:pos="4320"/>
+        </w:tabs>
+        <w:ind w:left="4320" w:hanging="360"/>
+      </w:pPr>
+    </w:lvl>
+    <w:lvl w:ilvl="6" w:tentative="1">
+      <w:start w:val="1"/>
+      <w:numFmt w:val="decimal"/>
+      <w:lvlText w:val="%7."/>
+      <w:lvlJc w:val="left"/>
+      <w:pPr>
+        <w:tabs>
+          <w:tab w:val="num" w:pos="5040"/>
+        </w:tabs>
+        <w:ind w:left="5040" w:hanging="360"/>
+      </w:pPr>
+    </w:lvl>
+    <w:lvl w:ilvl="7" w:tentative="1">
+      <w:start w:val="1"/>
+      <w:numFmt w:val="decimal"/>
+      <w:lvlText w:val="%8."/>
+      <w:lvlJc w:val="left"/>
+      <w:pPr>
+        <w:tabs>
+          <w:tab w:val="num" w:pos="5760"/>
+        </w:tabs>
+        <w:ind w:left="5760" w:hanging="360"/>
+      </w:pPr>
+    </w:lvl>
+    <w:lvl w:ilvl="8" w:tentative="1">
+      <w:start w:val="1"/>
+      <w:numFmt w:val="decimal"/>
+      <w:lvlText w:val="%9."/>
+      <w:lvlJc w:val="left"/>
+      <w:pPr>
+        <w:tabs>
+          <w:tab w:val="num" w:pos="6480"/>
+        </w:tabs>
+        <w:ind w:left="6480" w:hanging="360"/>
+      </w:pPr>
+    </w:lvl>
+  </w:abstractNum>
+  <w:abstractNum w:abstractNumId="79" w15:restartNumberingAfterBreak="0">
     <w:nsid w:val="57C90D88"/>
     <w:multiLevelType w:val="multilevel"/>
     <w:tmpl w:val="96FE2AC8"/>
@@ -24313,7 +26051,7 @@
       </w:rPr>
     </w:lvl>
   </w:abstractNum>
-  <w:abstractNum w:abstractNumId="73" w15:restartNumberingAfterBreak="0">
+  <w:abstractNum w:abstractNumId="80" w15:restartNumberingAfterBreak="0">
     <w:nsid w:val="590909F1"/>
     <w:multiLevelType w:val="multilevel"/>
     <w:tmpl w:val="2BEECC5C"/>
@@ -24462,7 +26200,7 @@
       </w:rPr>
     </w:lvl>
   </w:abstractNum>
-  <w:abstractNum w:abstractNumId="74" w15:restartNumberingAfterBreak="0">
+  <w:abstractNum w:abstractNumId="81" w15:restartNumberingAfterBreak="0">
     <w:nsid w:val="5A37430D"/>
     <w:multiLevelType w:val="multilevel"/>
     <w:tmpl w:val="E35AB092"/>
@@ -24575,7 +26313,7 @@
       </w:pPr>
     </w:lvl>
   </w:abstractNum>
-  <w:abstractNum w:abstractNumId="75" w15:restartNumberingAfterBreak="0">
+  <w:abstractNum w:abstractNumId="82" w15:restartNumberingAfterBreak="0">
     <w:nsid w:val="5AC50D18"/>
     <w:multiLevelType w:val="multilevel"/>
     <w:tmpl w:val="0A64F05A"/>
@@ -24688,7 +26426,7 @@
       </w:pPr>
     </w:lvl>
   </w:abstractNum>
-  <w:abstractNum w:abstractNumId="76" w15:restartNumberingAfterBreak="0">
+  <w:abstractNum w:abstractNumId="83" w15:restartNumberingAfterBreak="0">
     <w:nsid w:val="5BA87BC1"/>
     <w:multiLevelType w:val="multilevel"/>
     <w:tmpl w:val="07AC9870"/>
@@ -24833,7 +26571,7 @@
       </w:rPr>
     </w:lvl>
   </w:abstractNum>
-  <w:abstractNum w:abstractNumId="77" w15:restartNumberingAfterBreak="0">
+  <w:abstractNum w:abstractNumId="84" w15:restartNumberingAfterBreak="0">
     <w:nsid w:val="5C0E515A"/>
     <w:multiLevelType w:val="multilevel"/>
     <w:tmpl w:val="73643614"/>
@@ -24982,7 +26720,7 @@
       </w:rPr>
     </w:lvl>
   </w:abstractNum>
-  <w:abstractNum w:abstractNumId="78" w15:restartNumberingAfterBreak="0">
+  <w:abstractNum w:abstractNumId="85" w15:restartNumberingAfterBreak="0">
     <w:nsid w:val="5C2F3709"/>
     <w:multiLevelType w:val="multilevel"/>
     <w:tmpl w:val="2C787536"/>
@@ -25095,7 +26833,7 @@
       </w:pPr>
     </w:lvl>
   </w:abstractNum>
-  <w:abstractNum w:abstractNumId="79" w15:restartNumberingAfterBreak="0">
+  <w:abstractNum w:abstractNumId="86" w15:restartNumberingAfterBreak="0">
     <w:nsid w:val="60BE1BD1"/>
     <w:multiLevelType w:val="multilevel"/>
     <w:tmpl w:val="92485686"/>
@@ -25208,7 +26946,7 @@
       </w:pPr>
     </w:lvl>
   </w:abstractNum>
-  <w:abstractNum w:abstractNumId="80" w15:restartNumberingAfterBreak="0">
+  <w:abstractNum w:abstractNumId="87" w15:restartNumberingAfterBreak="0">
     <w:nsid w:val="61717056"/>
     <w:multiLevelType w:val="multilevel"/>
     <w:tmpl w:val="E57C4CD4"/>
@@ -25321,7 +27059,7 @@
       </w:pPr>
     </w:lvl>
   </w:abstractNum>
-  <w:abstractNum w:abstractNumId="81" w15:restartNumberingAfterBreak="0">
+  <w:abstractNum w:abstractNumId="88" w15:restartNumberingAfterBreak="0">
     <w:nsid w:val="63050B90"/>
     <w:multiLevelType w:val="multilevel"/>
     <w:tmpl w:val="8458B1F6"/>
@@ -25470,7 +27208,7 @@
       </w:rPr>
     </w:lvl>
   </w:abstractNum>
-  <w:abstractNum w:abstractNumId="82" w15:restartNumberingAfterBreak="0">
+  <w:abstractNum w:abstractNumId="89" w15:restartNumberingAfterBreak="0">
     <w:nsid w:val="636D188F"/>
     <w:multiLevelType w:val="multilevel"/>
     <w:tmpl w:val="9B128350"/>
@@ -25583,7 +27321,7 @@
       </w:pPr>
     </w:lvl>
   </w:abstractNum>
-  <w:abstractNum w:abstractNumId="83" w15:restartNumberingAfterBreak="0">
+  <w:abstractNum w:abstractNumId="90" w15:restartNumberingAfterBreak="0">
     <w:nsid w:val="64874BC5"/>
     <w:multiLevelType w:val="multilevel"/>
     <w:tmpl w:val="0DE0B358"/>
@@ -25732,7 +27470,7 @@
       </w:rPr>
     </w:lvl>
   </w:abstractNum>
-  <w:abstractNum w:abstractNumId="84" w15:restartNumberingAfterBreak="0">
+  <w:abstractNum w:abstractNumId="91" w15:restartNumberingAfterBreak="0">
     <w:nsid w:val="668F52A0"/>
     <w:multiLevelType w:val="multilevel"/>
     <w:tmpl w:val="FE8CC984"/>
@@ -25881,7 +27619,7 @@
       </w:rPr>
     </w:lvl>
   </w:abstractNum>
-  <w:abstractNum w:abstractNumId="85" w15:restartNumberingAfterBreak="0">
+  <w:abstractNum w:abstractNumId="92" w15:restartNumberingAfterBreak="0">
     <w:nsid w:val="66A81766"/>
     <w:multiLevelType w:val="multilevel"/>
     <w:tmpl w:val="A0926E8A"/>
@@ -26030,7 +27768,7 @@
       </w:rPr>
     </w:lvl>
   </w:abstractNum>
-  <w:abstractNum w:abstractNumId="86" w15:restartNumberingAfterBreak="0">
+  <w:abstractNum w:abstractNumId="93" w15:restartNumberingAfterBreak="0">
     <w:nsid w:val="6B5019CC"/>
     <w:multiLevelType w:val="multilevel"/>
     <w:tmpl w:val="C34CB002"/>
@@ -26175,7 +27913,7 @@
       </w:rPr>
     </w:lvl>
   </w:abstractNum>
-  <w:abstractNum w:abstractNumId="87" w15:restartNumberingAfterBreak="0">
+  <w:abstractNum w:abstractNumId="94" w15:restartNumberingAfterBreak="0">
     <w:nsid w:val="6CA4237C"/>
     <w:multiLevelType w:val="multilevel"/>
     <w:tmpl w:val="90C2D3D0"/>
@@ -26320,7 +28058,120 @@
       </w:rPr>
     </w:lvl>
   </w:abstractNum>
-  <w:abstractNum w:abstractNumId="88" w15:restartNumberingAfterBreak="0">
+  <w:abstractNum w:abstractNumId="95" w15:restartNumberingAfterBreak="0">
+    <w:nsid w:val="6E4D4A90"/>
+    <w:multiLevelType w:val="multilevel"/>
+    <w:tmpl w:val="4FBC4DFC"/>
+    <w:lvl w:ilvl="0">
+      <w:start w:val="1"/>
+      <w:numFmt w:val="decimal"/>
+      <w:lvlText w:val="%1."/>
+      <w:lvlJc w:val="left"/>
+      <w:pPr>
+        <w:tabs>
+          <w:tab w:val="num" w:pos="720"/>
+        </w:tabs>
+        <w:ind w:left="720" w:hanging="360"/>
+      </w:pPr>
+    </w:lvl>
+    <w:lvl w:ilvl="1" w:tentative="1">
+      <w:start w:val="1"/>
+      <w:numFmt w:val="decimal"/>
+      <w:lvlText w:val="%2."/>
+      <w:lvlJc w:val="left"/>
+      <w:pPr>
+        <w:tabs>
+          <w:tab w:val="num" w:pos="1440"/>
+        </w:tabs>
+        <w:ind w:left="1440" w:hanging="360"/>
+      </w:pPr>
+    </w:lvl>
+    <w:lvl w:ilvl="2" w:tentative="1">
+      <w:start w:val="1"/>
+      <w:numFmt w:val="decimal"/>
+      <w:lvlText w:val="%3."/>
+      <w:lvlJc w:val="left"/>
+      <w:pPr>
+        <w:tabs>
+          <w:tab w:val="num" w:pos="2160"/>
+        </w:tabs>
+        <w:ind w:left="2160" w:hanging="360"/>
+      </w:pPr>
+    </w:lvl>
+    <w:lvl w:ilvl="3" w:tentative="1">
+      <w:start w:val="1"/>
+      <w:numFmt w:val="decimal"/>
+      <w:lvlText w:val="%4."/>
+      <w:lvlJc w:val="left"/>
+      <w:pPr>
+        <w:tabs>
+          <w:tab w:val="num" w:pos="2880"/>
+        </w:tabs>
+        <w:ind w:left="2880" w:hanging="360"/>
+      </w:pPr>
+    </w:lvl>
+    <w:lvl w:ilvl="4" w:tentative="1">
+      <w:start w:val="1"/>
+      <w:numFmt w:val="decimal"/>
+      <w:lvlText w:val="%5."/>
+      <w:lvlJc w:val="left"/>
+      <w:pPr>
+        <w:tabs>
+          <w:tab w:val="num" w:pos="3600"/>
+        </w:tabs>
+        <w:ind w:left="3600" w:hanging="360"/>
+      </w:pPr>
+    </w:lvl>
+    <w:lvl w:ilvl="5" w:tentative="1">
+      <w:start w:val="1"/>
+      <w:numFmt w:val="decimal"/>
+      <w:lvlText w:val="%6."/>
+      <w:lvlJc w:val="left"/>
+      <w:pPr>
+        <w:tabs>
+          <w:tab w:val="num" w:pos="4320"/>
+        </w:tabs>
+        <w:ind w:left="4320" w:hanging="360"/>
+      </w:pPr>
+    </w:lvl>
+    <w:lvl w:ilvl="6" w:tentative="1">
+      <w:start w:val="1"/>
+      <w:numFmt w:val="decimal"/>
+      <w:lvlText w:val="%7."/>
+      <w:lvlJc w:val="left"/>
+      <w:pPr>
+        <w:tabs>
+          <w:tab w:val="num" w:pos="5040"/>
+        </w:tabs>
+        <w:ind w:left="5040" w:hanging="360"/>
+      </w:pPr>
+    </w:lvl>
+    <w:lvl w:ilvl="7" w:tentative="1">
+      <w:start w:val="1"/>
+      <w:numFmt w:val="decimal"/>
+      <w:lvlText w:val="%8."/>
+      <w:lvlJc w:val="left"/>
+      <w:pPr>
+        <w:tabs>
+          <w:tab w:val="num" w:pos="5760"/>
+        </w:tabs>
+        <w:ind w:left="5760" w:hanging="360"/>
+      </w:pPr>
+    </w:lvl>
+    <w:lvl w:ilvl="8" w:tentative="1">
+      <w:start w:val="1"/>
+      <w:numFmt w:val="decimal"/>
+      <w:lvlText w:val="%9."/>
+      <w:lvlJc w:val="left"/>
+      <w:pPr>
+        <w:tabs>
+          <w:tab w:val="num" w:pos="6480"/>
+        </w:tabs>
+        <w:ind w:left="6480" w:hanging="360"/>
+      </w:pPr>
+    </w:lvl>
+  </w:abstractNum>
+  <w:abstractNum w:abstractNumId="96" w15:restartNumberingAfterBreak="0">
     <w:nsid w:val="71F16AA6"/>
     <w:multiLevelType w:val="multilevel"/>
     <w:tmpl w:val="718C759E"/>
@@ -26433,7 +28284,156 @@
       </w:pPr>
     </w:lvl>
   </w:abstractNum>
-  <w:abstractNum w:abstractNumId="89" w15:restartNumberingAfterBreak="0">
+  <w:abstractNum w:abstractNumId="97" w15:restartNumberingAfterBreak="0">
+    <w:nsid w:val="73847262"/>
+    <w:multiLevelType w:val="multilevel"/>
+    <w:tmpl w:val="DB7006E0"/>
+    <w:lvl w:ilvl="0">
+      <w:start w:val="1"/>
+      <w:numFmt w:val="bullet"/>
+      <w:lvlText w:val=""/>
+      <w:lvlJc w:val="left"/>
+      <w:pPr>
+        <w:tabs>
+          <w:tab w:val="num" w:pos="720"/>
+        </w:tabs>
+        <w:ind w:left="720" w:hanging="360"/>
+      </w:pPr>
+      <w:rPr>
+        <w:rFonts w:ascii="Symbol" w:hAnsi="Symbol" w:hint="default"/>
+        <w:sz w:val="20"/>
+      </w:rPr>
+    </w:lvl>
+    <w:lvl w:ilvl="1" w:tentative="1">
+      <w:start w:val="1"/>
+      <w:numFmt w:val="bullet"/>
+      <w:lvlText w:val="o"/>
+      <w:lvlJc w:val="left"/>
+      <w:pPr>
+        <w:tabs>
+          <w:tab w:val="num" w:pos="1440"/>
+        </w:tabs>
+        <w:ind w:left="1440" w:hanging="360"/>
+      </w:pPr>
+      <w:rPr>
+        <w:rFonts w:ascii="Courier New" w:hAnsi="Courier New" w:hint="default"/>
+        <w:sz w:val="20"/>
+      </w:rPr>
+    </w:lvl>
+    <w:lvl w:ilvl="2" w:tentative="1">
+      <w:start w:val="1"/>
+      <w:numFmt w:val="bullet"/>
+      <w:lvlText w:val=""/>
+      <w:lvlJc w:val="left"/>
+      <w:pPr>
+        <w:tabs>
+          <w:tab w:val="num" w:pos="2160"/>
+        </w:tabs>
+        <w:ind w:left="2160" w:hanging="360"/>
+      </w:pPr>
+      <w:rPr>
+        <w:rFonts w:ascii="Wingdings" w:hAnsi="Wingdings" w:hint="default"/>
+        <w:sz w:val="20"/>
+      </w:rPr>
+    </w:lvl>
+    <w:lvl w:ilvl="3" w:tentative="1">
+      <w:start w:val="1"/>
+      <w:numFmt w:val="bullet"/>
+      <w:lvlText w:val=""/>
+      <w:lvlJc w:val="left"/>
+      <w:pPr>
+        <w:tabs>
+          <w:tab w:val="num" w:pos="2880"/>
+        </w:tabs>
+        <w:ind w:left="2880" w:hanging="360"/>
+      </w:pPr>
+      <w:rPr>
+        <w:rFonts w:ascii="Wingdings" w:hAnsi="Wingdings" w:hint="default"/>
+        <w:sz w:val="20"/>
+      </w:rPr>
+    </w:lvl>
+    <w:lvl w:ilvl="4" w:tentative="1">
+      <w:start w:val="1"/>
+      <w:numFmt w:val="bullet"/>
+      <w:lvlText w:val=""/>
+      <w:lvlJc w:val="left"/>
+      <w:pPr>
+        <w:tabs>
+          <w:tab w:val="num" w:pos="3600"/>
+        </w:tabs>
+        <w:ind w:left="3600" w:hanging="360"/>
+      </w:pPr>
+      <w:rPr>
+        <w:rFonts w:ascii="Wingdings" w:hAnsi="Wingdings" w:hint="default"/>
+        <w:sz w:val="20"/>
+      </w:rPr>
+    </w:lvl>
+    <w:lvl w:ilvl="5" w:tentative="1">
+      <w:start w:val="1"/>
+      <w:numFmt w:val="bullet"/>
+      <w:lvlText w:val=""/>
+      <w:lvlJc w:val="left"/>
+      <w:pPr>
+        <w:tabs>
+          <w:tab w:val="num" w:pos="4320"/>
+        </w:tabs>
+        <w:ind w:left="4320" w:hanging="360"/>
+      </w:pPr>
+      <w:rPr>
+        <w:rFonts w:ascii="Wingdings" w:hAnsi="Wingdings" w:hint="default"/>
+        <w:sz w:val="20"/>
+      </w:rPr>
+    </w:lvl>
+    <w:lvl w:ilvl="6" w:tentative="1">
+      <w:start w:val="1"/>
+      <w:numFmt w:val="bullet"/>
+      <w:lvlText w:val=""/>
+      <w:lvlJc w:val="left"/>
+      <w:pPr>
+        <w:tabs>
+          <w:tab w:val="num" w:pos="5040"/>
+        </w:tabs>
+        <w:ind w:left="5040" w:hanging="360"/>
+      </w:pPr>
+      <w:rPr>
+        <w:rFonts w:ascii="Wingdings" w:hAnsi="Wingdings" w:hint="default"/>
+        <w:sz w:val="20"/>
+      </w:rPr>
+    </w:lvl>
+    <w:lvl w:ilvl="7" w:tentative="1">
+      <w:start w:val="1"/>
+      <w:numFmt w:val="bullet"/>
+      <w:lvlText w:val=""/>
+      <w:lvlJc w:val="left"/>
+      <w:pPr>
+        <w:tabs>
+          <w:tab w:val="num" w:pos="5760"/>
+        </w:tabs>
+        <w:ind w:left="5760" w:hanging="360"/>
+      </w:pPr>
+      <w:rPr>
+        <w:rFonts w:ascii="Wingdings" w:hAnsi="Wingdings" w:hint="default"/>
+        <w:sz w:val="20"/>
+      </w:rPr>
+    </w:lvl>
+    <w:lvl w:ilvl="8" w:tentative="1">
+      <w:start w:val="1"/>
+      <w:numFmt w:val="bullet"/>
+      <w:lvlText w:val=""/>
+      <w:lvlJc w:val="left"/>
+      <w:pPr>
+        <w:tabs>
+          <w:tab w:val="num" w:pos="6480"/>
+        </w:tabs>
+        <w:ind w:left="6480" w:hanging="360"/>
+      </w:pPr>
+      <w:rPr>
+        <w:rFonts w:ascii="Wingdings" w:hAnsi="Wingdings" w:hint="default"/>
+        <w:sz w:val="20"/>
+      </w:rPr>
+    </w:lvl>
+  </w:abstractNum>
+  <w:abstractNum w:abstractNumId="98" w15:restartNumberingAfterBreak="0">
     <w:nsid w:val="74C15120"/>
     <w:multiLevelType w:val="multilevel"/>
     <w:tmpl w:val="1A84AD6C"/>
@@ -26582,7 +28582,7 @@
       </w:rPr>
     </w:lvl>
   </w:abstractNum>
-  <w:abstractNum w:abstractNumId="90" w15:restartNumberingAfterBreak="0">
+  <w:abstractNum w:abstractNumId="99" w15:restartNumberingAfterBreak="0">
     <w:nsid w:val="7636516F"/>
     <w:multiLevelType w:val="multilevel"/>
     <w:tmpl w:val="8DCE8D66"/>
@@ -26695,7 +28695,7 @@
       </w:pPr>
     </w:lvl>
   </w:abstractNum>
-  <w:abstractNum w:abstractNumId="91" w15:restartNumberingAfterBreak="0">
+  <w:abstractNum w:abstractNumId="100" w15:restartNumberingAfterBreak="0">
     <w:nsid w:val="76921C18"/>
     <w:multiLevelType w:val="multilevel"/>
     <w:tmpl w:val="1556D09A"/>
@@ -26844,7 +28844,7 @@
       </w:rPr>
     </w:lvl>
   </w:abstractNum>
-  <w:abstractNum w:abstractNumId="92" w15:restartNumberingAfterBreak="0">
+  <w:abstractNum w:abstractNumId="101" w15:restartNumberingAfterBreak="0">
     <w:nsid w:val="78A119C4"/>
     <w:multiLevelType w:val="multilevel"/>
     <w:tmpl w:val="68B69A8C"/>
@@ -26957,7 +28957,120 @@
       </w:pPr>
     </w:lvl>
   </w:abstractNum>
-  <w:abstractNum w:abstractNumId="93" w15:restartNumberingAfterBreak="0">
+  <w:abstractNum w:abstractNumId="102" w15:restartNumberingAfterBreak="0">
+    <w:nsid w:val="7ADF1B46"/>
+    <w:multiLevelType w:val="multilevel"/>
+    <w:tmpl w:val="1B7E1068"/>
+    <w:lvl w:ilvl="0">
+      <w:start w:val="1"/>
+      <w:numFmt w:val="decimal"/>
+      <w:lvlText w:val="%1."/>
+      <w:lvlJc w:val="left"/>
+      <w:pPr>
+        <w:tabs>
+          <w:tab w:val="num" w:pos="720"/>
+        </w:tabs>
+        <w:ind w:left="720" w:hanging="360"/>
+      </w:pPr>
+    </w:lvl>
+    <w:lvl w:ilvl="1" w:tentative="1">
+      <w:start w:val="1"/>
+      <w:numFmt w:val="decimal"/>
+      <w:lvlText w:val="%2."/>
+      <w:lvlJc w:val="left"/>
+      <w:pPr>
+        <w:tabs>
+          <w:tab w:val="num" w:pos="1440"/>
+        </w:tabs>
+        <w:ind w:left="1440" w:hanging="360"/>
+      </w:pPr>
+    </w:lvl>
+    <w:lvl w:ilvl="2" w:tentative="1">
+      <w:start w:val="1"/>
+      <w:numFmt w:val="decimal"/>
+      <w:lvlText w:val="%3."/>
+      <w:lvlJc w:val="left"/>
+      <w:pPr>
+        <w:tabs>
+          <w:tab w:val="num" w:pos="2160"/>
+        </w:tabs>
+        <w:ind w:left="2160" w:hanging="360"/>
+      </w:pPr>
+    </w:lvl>
+    <w:lvl w:ilvl="3" w:tentative="1">
+      <w:start w:val="1"/>
+      <w:numFmt w:val="decimal"/>
+      <w:lvlText w:val="%4."/>
+      <w:lvlJc w:val="left"/>
+      <w:pPr>
+        <w:tabs>
+          <w:tab w:val="num" w:pos="2880"/>
+        </w:tabs>
+        <w:ind w:left="2880" w:hanging="360"/>
+      </w:pPr>
+    </w:lvl>
+    <w:lvl w:ilvl="4" w:tentative="1">
+      <w:start w:val="1"/>
+      <w:numFmt w:val="decimal"/>
+      <w:lvlText w:val="%5."/>
+      <w:lvlJc w:val="left"/>
+      <w:pPr>
+        <w:tabs>
+          <w:tab w:val="num" w:pos="3600"/>
+        </w:tabs>
+        <w:ind w:left="3600" w:hanging="360"/>
+      </w:pPr>
+    </w:lvl>
+    <w:lvl w:ilvl="5" w:tentative="1">
+      <w:start w:val="1"/>
+      <w:numFmt w:val="decimal"/>
+      <w:lvlText w:val="%6."/>
+      <w:lvlJc w:val="left"/>
+      <w:pPr>
+        <w:tabs>
+          <w:tab w:val="num" w:pos="4320"/>
+        </w:tabs>
+        <w:ind w:left="4320" w:hanging="360"/>
+      </w:pPr>
+    </w:lvl>
+    <w:lvl w:ilvl="6" w:tentative="1">
+      <w:start w:val="1"/>
+      <w:numFmt w:val="decimal"/>
+      <w:lvlText w:val="%7."/>
+      <w:lvlJc w:val="left"/>
+      <w:pPr>
+        <w:tabs>
+          <w:tab w:val="num" w:pos="5040"/>
+        </w:tabs>
+        <w:ind w:left="5040" w:hanging="360"/>
+      </w:pPr>
+    </w:lvl>
+    <w:lvl w:ilvl="7" w:tentative="1">
+      <w:start w:val="1"/>
+      <w:numFmt w:val="decimal"/>
+      <w:lvlText w:val="%8."/>
+      <w:lvlJc w:val="left"/>
+      <w:pPr>
+        <w:tabs>
+          <w:tab w:val="num" w:pos="5760"/>
+        </w:tabs>
+        <w:ind w:left="5760" w:hanging="360"/>
+      </w:pPr>
+    </w:lvl>
+    <w:lvl w:ilvl="8" w:tentative="1">
+      <w:start w:val="1"/>
+      <w:numFmt w:val="decimal"/>
+      <w:lvlText w:val="%9."/>
+      <w:lvlJc w:val="left"/>
+      <w:pPr>
+        <w:tabs>
+          <w:tab w:val="num" w:pos="6480"/>
+        </w:tabs>
+        <w:ind w:left="6480" w:hanging="360"/>
+      </w:pPr>
+    </w:lvl>
+  </w:abstractNum>
+  <w:abstractNum w:abstractNumId="103" w15:restartNumberingAfterBreak="0">
     <w:nsid w:val="7C593B46"/>
     <w:multiLevelType w:val="multilevel"/>
     <w:tmpl w:val="3BC68F2A"/>
@@ -27070,7 +29183,7 @@
       </w:pPr>
     </w:lvl>
   </w:abstractNum>
-  <w:abstractNum w:abstractNumId="94" w15:restartNumberingAfterBreak="0">
+  <w:abstractNum w:abstractNumId="104" w15:restartNumberingAfterBreak="0">
     <w:nsid w:val="7C5E697B"/>
     <w:multiLevelType w:val="multilevel"/>
     <w:tmpl w:val="C02A7BAA"/>
@@ -27183,7 +29296,7 @@
       </w:pPr>
     </w:lvl>
   </w:abstractNum>
-  <w:abstractNum w:abstractNumId="95" w15:restartNumberingAfterBreak="0">
+  <w:abstractNum w:abstractNumId="105" w15:restartNumberingAfterBreak="0">
     <w:nsid w:val="7CAE7295"/>
     <w:multiLevelType w:val="multilevel"/>
     <w:tmpl w:val="215C0D12"/>
@@ -27296,7 +29409,7 @@
       </w:pPr>
     </w:lvl>
   </w:abstractNum>
-  <w:abstractNum w:abstractNumId="96" w15:restartNumberingAfterBreak="0">
+  <w:abstractNum w:abstractNumId="106" w15:restartNumberingAfterBreak="0">
     <w:nsid w:val="7EBA6FEE"/>
     <w:multiLevelType w:val="multilevel"/>
     <w:tmpl w:val="90521802"/>
@@ -27445,7 +29558,7 @@
       </w:rPr>
     </w:lvl>
   </w:abstractNum>
-  <w:abstractNum w:abstractNumId="97" w15:restartNumberingAfterBreak="0">
+  <w:abstractNum w:abstractNumId="107" w15:restartNumberingAfterBreak="0">
     <w:nsid w:val="7EC64166"/>
     <w:multiLevelType w:val="multilevel"/>
     <w:tmpl w:val="5B4E36D6"/>
@@ -27595,28 +29708,28 @@
     </w:lvl>
   </w:abstractNum>
   <w:num w:numId="1" w16cid:durableId="1485967246">
-    <w:abstractNumId w:val="44"/>
+    <w:abstractNumId w:val="48"/>
   </w:num>
   <w:num w:numId="2" w16cid:durableId="1060515020">
-    <w:abstractNumId w:val="89"/>
+    <w:abstractNumId w:val="98"/>
   </w:num>
   <w:num w:numId="3" w16cid:durableId="166214235">
-    <w:abstractNumId w:val="50"/>
+    <w:abstractNumId w:val="54"/>
   </w:num>
   <w:num w:numId="4" w16cid:durableId="635063584">
-    <w:abstractNumId w:val="91"/>
+    <w:abstractNumId w:val="100"/>
   </w:num>
   <w:num w:numId="5" w16cid:durableId="1488328455">
     <w:abstractNumId w:val="0"/>
   </w:num>
   <w:num w:numId="6" w16cid:durableId="1820532546">
-    <w:abstractNumId w:val="19"/>
+    <w:abstractNumId w:val="22"/>
   </w:num>
   <w:num w:numId="7" w16cid:durableId="217979751">
-    <w:abstractNumId w:val="74"/>
+    <w:abstractNumId w:val="81"/>
   </w:num>
   <w:num w:numId="8" w16cid:durableId="824931281">
-    <w:abstractNumId w:val="74"/>
+    <w:abstractNumId w:val="81"/>
     <w:lvlOverride w:ilvl="1">
       <w:lvl w:ilvl="1">
         <w:numFmt w:val="decimal"/>
@@ -27626,277 +29739,307 @@
     </w:lvlOverride>
   </w:num>
   <w:num w:numId="9" w16cid:durableId="1247495937">
+    <w:abstractNumId w:val="71"/>
+  </w:num>
+  <w:num w:numId="10" w16cid:durableId="2115979461">
+    <w:abstractNumId w:val="40"/>
+  </w:num>
+  <w:num w:numId="11" w16cid:durableId="1488744066">
+    <w:abstractNumId w:val="5"/>
+  </w:num>
+  <w:num w:numId="12" w16cid:durableId="739714594">
+    <w:abstractNumId w:val="57"/>
+  </w:num>
+  <w:num w:numId="13" w16cid:durableId="742068307">
+    <w:abstractNumId w:val="26"/>
+  </w:num>
+  <w:num w:numId="14" w16cid:durableId="911890441">
+    <w:abstractNumId w:val="91"/>
+  </w:num>
+  <w:num w:numId="15" w16cid:durableId="1337803996">
+    <w:abstractNumId w:val="21"/>
+  </w:num>
+  <w:num w:numId="16" w16cid:durableId="32273097">
+    <w:abstractNumId w:val="107"/>
+  </w:num>
+  <w:num w:numId="17" w16cid:durableId="528950544">
+    <w:abstractNumId w:val="92"/>
+  </w:num>
+  <w:num w:numId="18" w16cid:durableId="381173997">
+    <w:abstractNumId w:val="11"/>
+  </w:num>
+  <w:num w:numId="19" w16cid:durableId="905799505">
+    <w:abstractNumId w:val="29"/>
+  </w:num>
+  <w:num w:numId="20" w16cid:durableId="360477177">
+    <w:abstractNumId w:val="83"/>
+  </w:num>
+  <w:num w:numId="21" w16cid:durableId="1364818147">
+    <w:abstractNumId w:val="39"/>
+  </w:num>
+  <w:num w:numId="22" w16cid:durableId="379861897">
+    <w:abstractNumId w:val="93"/>
+  </w:num>
+  <w:num w:numId="23" w16cid:durableId="1140224231">
+    <w:abstractNumId w:val="42"/>
+  </w:num>
+  <w:num w:numId="24" w16cid:durableId="1789008370">
+    <w:abstractNumId w:val="41"/>
+  </w:num>
+  <w:num w:numId="25" w16cid:durableId="1008286715">
+    <w:abstractNumId w:val="106"/>
+  </w:num>
+  <w:num w:numId="26" w16cid:durableId="2094541931">
+    <w:abstractNumId w:val="56"/>
+  </w:num>
+  <w:num w:numId="27" w16cid:durableId="576012676">
+    <w:abstractNumId w:val="43"/>
+  </w:num>
+  <w:num w:numId="28" w16cid:durableId="761488549">
+    <w:abstractNumId w:val="24"/>
+  </w:num>
+  <w:num w:numId="29" w16cid:durableId="1042558868">
+    <w:abstractNumId w:val="74"/>
+  </w:num>
+  <w:num w:numId="30" w16cid:durableId="1916746720">
+    <w:abstractNumId w:val="69"/>
+  </w:num>
+  <w:num w:numId="31" w16cid:durableId="129595486">
+    <w:abstractNumId w:val="47"/>
+  </w:num>
+  <w:num w:numId="32" w16cid:durableId="432407949">
+    <w:abstractNumId w:val="14"/>
+  </w:num>
+  <w:num w:numId="33" w16cid:durableId="1506896887">
+    <w:abstractNumId w:val="30"/>
+  </w:num>
+  <w:num w:numId="34" w16cid:durableId="1656715276">
+    <w:abstractNumId w:val="6"/>
+  </w:num>
+  <w:num w:numId="35" w16cid:durableId="1126462221">
+    <w:abstractNumId w:val="37"/>
+  </w:num>
+  <w:num w:numId="36" w16cid:durableId="684556098">
+    <w:abstractNumId w:val="15"/>
+  </w:num>
+  <w:num w:numId="37" w16cid:durableId="356128053">
+    <w:abstractNumId w:val="67"/>
+  </w:num>
+  <w:num w:numId="38" w16cid:durableId="1322272628">
+    <w:abstractNumId w:val="68"/>
+  </w:num>
+  <w:num w:numId="39" w16cid:durableId="1031220316">
+    <w:abstractNumId w:val="94"/>
+  </w:num>
+  <w:num w:numId="40" w16cid:durableId="1373573612">
+    <w:abstractNumId w:val="4"/>
+  </w:num>
+  <w:num w:numId="41" w16cid:durableId="634527523">
+    <w:abstractNumId w:val="31"/>
+  </w:num>
+  <w:num w:numId="42" w16cid:durableId="1484660289">
     <w:abstractNumId w:val="65"/>
   </w:num>
-  <w:num w:numId="10" w16cid:durableId="2115979461">
+  <w:num w:numId="43" w16cid:durableId="1783457883">
+    <w:abstractNumId w:val="90"/>
+  </w:num>
+  <w:num w:numId="44" w16cid:durableId="1214973022">
+    <w:abstractNumId w:val="46"/>
+  </w:num>
+  <w:num w:numId="45" w16cid:durableId="2067143149">
     <w:abstractNumId w:val="36"/>
   </w:num>
-  <w:num w:numId="11" w16cid:durableId="1488744066">
-    <w:abstractNumId w:val="4"/>
-  </w:num>
-  <w:num w:numId="12" w16cid:durableId="739714594">
-    <w:abstractNumId w:val="53"/>
-  </w:num>
-  <w:num w:numId="13" w16cid:durableId="742068307">
-    <w:abstractNumId w:val="22"/>
-  </w:num>
-  <w:num w:numId="14" w16cid:durableId="911890441">
+  <w:num w:numId="46" w16cid:durableId="193228300">
     <w:abstractNumId w:val="84"/>
   </w:num>
-  <w:num w:numId="15" w16cid:durableId="1337803996">
-    <w:abstractNumId w:val="18"/>
+  <w:num w:numId="47" w16cid:durableId="1919054178">
+    <w:abstractNumId w:val="17"/>
   </w:num>
-  <w:num w:numId="16" w16cid:durableId="32273097">
-    <w:abstractNumId w:val="97"/>
+  <w:num w:numId="48" w16cid:durableId="487091626">
+    <w:abstractNumId w:val="12"/>
   </w:num>
-  <w:num w:numId="17" w16cid:durableId="528950544">
-    <w:abstractNumId w:val="85"/>
+  <w:num w:numId="49" w16cid:durableId="1977027139">
+    <w:abstractNumId w:val="70"/>
   </w:num>
-  <w:num w:numId="18" w16cid:durableId="381173997">
+  <w:num w:numId="50" w16cid:durableId="1847478714">
+    <w:abstractNumId w:val="88"/>
+  </w:num>
+  <w:num w:numId="51" w16cid:durableId="1941601938">
+    <w:abstractNumId w:val="35"/>
+  </w:num>
+  <w:num w:numId="52" w16cid:durableId="196241091">
+    <w:abstractNumId w:val="99"/>
+  </w:num>
+  <w:num w:numId="53" w16cid:durableId="1055813885">
+    <w:abstractNumId w:val="8"/>
+  </w:num>
+  <w:num w:numId="54" w16cid:durableId="1665666932">
+    <w:abstractNumId w:val="79"/>
+  </w:num>
+  <w:num w:numId="55" w16cid:durableId="1548639069">
+    <w:abstractNumId w:val="105"/>
+  </w:num>
+  <w:num w:numId="56" w16cid:durableId="373433159">
+    <w:abstractNumId w:val="82"/>
+  </w:num>
+  <w:num w:numId="57" w16cid:durableId="1312909043">
+    <w:abstractNumId w:val="16"/>
+  </w:num>
+  <w:num w:numId="58" w16cid:durableId="1809661571">
+    <w:abstractNumId w:val="59"/>
+  </w:num>
+  <w:num w:numId="59" w16cid:durableId="1545827899">
+    <w:abstractNumId w:val="87"/>
+  </w:num>
+  <w:num w:numId="60" w16cid:durableId="1716348091">
     <w:abstractNumId w:val="9"/>
   </w:num>
-  <w:num w:numId="19" w16cid:durableId="905799505">
-    <w:abstractNumId w:val="25"/>
-  </w:num>
-  <w:num w:numId="20" w16cid:durableId="360477177">
-    <w:abstractNumId w:val="76"/>
-  </w:num>
-  <w:num w:numId="21" w16cid:durableId="1364818147">
-    <w:abstractNumId w:val="35"/>
-  </w:num>
-  <w:num w:numId="22" w16cid:durableId="379861897">
-    <w:abstractNumId w:val="86"/>
-  </w:num>
-  <w:num w:numId="23" w16cid:durableId="1140224231">
-    <w:abstractNumId w:val="38"/>
-  </w:num>
-  <w:num w:numId="24" w16cid:durableId="1789008370">
-    <w:abstractNumId w:val="37"/>
-  </w:num>
-  <w:num w:numId="25" w16cid:durableId="1008286715">
-    <w:abstractNumId w:val="96"/>
-  </w:num>
-  <w:num w:numId="26" w16cid:durableId="2094541931">
-    <w:abstractNumId w:val="52"/>
-  </w:num>
-  <w:num w:numId="27" w16cid:durableId="576012676">
-    <w:abstractNumId w:val="39"/>
-  </w:num>
-  <w:num w:numId="28" w16cid:durableId="761488549">
-    <w:abstractNumId w:val="21"/>
-  </w:num>
-  <w:num w:numId="29" w16cid:durableId="1042558868">
-    <w:abstractNumId w:val="68"/>
-  </w:num>
-  <w:num w:numId="30" w16cid:durableId="1916746720">
-    <w:abstractNumId w:val="63"/>
-  </w:num>
-  <w:num w:numId="31" w16cid:durableId="129595486">
-    <w:abstractNumId w:val="43"/>
-  </w:num>
-  <w:num w:numId="32" w16cid:durableId="432407949">
-    <w:abstractNumId w:val="11"/>
-  </w:num>
-  <w:num w:numId="33" w16cid:durableId="1506896887">
-    <w:abstractNumId w:val="26"/>
-  </w:num>
-  <w:num w:numId="34" w16cid:durableId="1656715276">
-    <w:abstractNumId w:val="5"/>
-  </w:num>
-  <w:num w:numId="35" w16cid:durableId="1126462221">
-    <w:abstractNumId w:val="33"/>
-  </w:num>
-  <w:num w:numId="36" w16cid:durableId="684556098">
-    <w:abstractNumId w:val="12"/>
-  </w:num>
-  <w:num w:numId="37" w16cid:durableId="356128053">
-    <w:abstractNumId w:val="61"/>
-  </w:num>
-  <w:num w:numId="38" w16cid:durableId="1322272628">
-    <w:abstractNumId w:val="62"/>
-  </w:num>
-  <w:num w:numId="39" w16cid:durableId="1031220316">
-    <w:abstractNumId w:val="87"/>
-  </w:num>
-  <w:num w:numId="40" w16cid:durableId="1373573612">
-    <w:abstractNumId w:val="3"/>
-  </w:num>
-  <w:num w:numId="41" w16cid:durableId="634527523">
-    <w:abstractNumId w:val="27"/>
-  </w:num>
-  <w:num w:numId="42" w16cid:durableId="1484660289">
-    <w:abstractNumId w:val="59"/>
-  </w:num>
-  <w:num w:numId="43" w16cid:durableId="1783457883">
-    <w:abstractNumId w:val="83"/>
-  </w:num>
-  <w:num w:numId="44" w16cid:durableId="1214973022">
-    <w:abstractNumId w:val="42"/>
-  </w:num>
-  <w:num w:numId="45" w16cid:durableId="2067143149">
-    <w:abstractNumId w:val="32"/>
-  </w:num>
-  <w:num w:numId="46" w16cid:durableId="193228300">
-    <w:abstractNumId w:val="77"/>
-  </w:num>
-  <w:num w:numId="47" w16cid:durableId="1919054178">
-    <w:abstractNumId w:val="14"/>
-  </w:num>
-  <w:num w:numId="48" w16cid:durableId="487091626">
-    <w:abstractNumId w:val="10"/>
-  </w:num>
-  <w:num w:numId="49" w16cid:durableId="1977027139">
-    <w:abstractNumId w:val="64"/>
-  </w:num>
-  <w:num w:numId="50" w16cid:durableId="1847478714">
-    <w:abstractNumId w:val="81"/>
-  </w:num>
-  <w:num w:numId="51" w16cid:durableId="1941601938">
-    <w:abstractNumId w:val="31"/>
-  </w:num>
-  <w:num w:numId="52" w16cid:durableId="196241091">
-    <w:abstractNumId w:val="90"/>
-  </w:num>
-  <w:num w:numId="53" w16cid:durableId="1055813885">
-    <w:abstractNumId w:val="7"/>
-  </w:num>
-  <w:num w:numId="54" w16cid:durableId="1665666932">
-    <w:abstractNumId w:val="72"/>
-  </w:num>
-  <w:num w:numId="55" w16cid:durableId="1548639069">
-    <w:abstractNumId w:val="95"/>
-  </w:num>
-  <w:num w:numId="56" w16cid:durableId="373433159">
-    <w:abstractNumId w:val="75"/>
-  </w:num>
-  <w:num w:numId="57" w16cid:durableId="1312909043">
-    <w:abstractNumId w:val="13"/>
-  </w:num>
-  <w:num w:numId="58" w16cid:durableId="1809661571">
-    <w:abstractNumId w:val="54"/>
-  </w:num>
-  <w:num w:numId="59" w16cid:durableId="1545827899">
-    <w:abstractNumId w:val="80"/>
-  </w:num>
-  <w:num w:numId="60" w16cid:durableId="1716348091">
-    <w:abstractNumId w:val="8"/>
-  </w:num>
   <w:num w:numId="61" w16cid:durableId="817647083">
-    <w:abstractNumId w:val="15"/>
+    <w:abstractNumId w:val="18"/>
   </w:num>
   <w:num w:numId="62" w16cid:durableId="233201404">
     <w:abstractNumId w:val="1"/>
   </w:num>
   <w:num w:numId="63" w16cid:durableId="1157502318">
-    <w:abstractNumId w:val="56"/>
+    <w:abstractNumId w:val="61"/>
   </w:num>
   <w:num w:numId="64" w16cid:durableId="632253821">
+    <w:abstractNumId w:val="66"/>
+  </w:num>
+  <w:num w:numId="65" w16cid:durableId="574096445">
+    <w:abstractNumId w:val="33"/>
+  </w:num>
+  <w:num w:numId="66" w16cid:durableId="1679042737">
+    <w:abstractNumId w:val="72"/>
+  </w:num>
+  <w:num w:numId="67" w16cid:durableId="1641765291">
+    <w:abstractNumId w:val="55"/>
+  </w:num>
+  <w:num w:numId="68" w16cid:durableId="1096514703">
+    <w:abstractNumId w:val="49"/>
+  </w:num>
+  <w:num w:numId="69" w16cid:durableId="399864210">
+    <w:abstractNumId w:val="85"/>
+  </w:num>
+  <w:num w:numId="70" w16cid:durableId="125855137">
     <w:abstractNumId w:val="60"/>
   </w:num>
-  <w:num w:numId="65" w16cid:durableId="574096445">
-    <w:abstractNumId w:val="29"/>
+  <w:num w:numId="71" w16cid:durableId="688288430">
+    <w:abstractNumId w:val="34"/>
   </w:num>
-  <w:num w:numId="66" w16cid:durableId="1679042737">
-    <w:abstractNumId w:val="66"/>
+  <w:num w:numId="72" w16cid:durableId="1774746457">
+    <w:abstractNumId w:val="53"/>
   </w:num>
-  <w:num w:numId="67" w16cid:durableId="1641765291">
-    <w:abstractNumId w:val="51"/>
+  <w:num w:numId="73" w16cid:durableId="1410351349">
+    <w:abstractNumId w:val="73"/>
   </w:num>
-  <w:num w:numId="68" w16cid:durableId="1096514703">
+  <w:num w:numId="74" w16cid:durableId="1829247184">
+    <w:abstractNumId w:val="38"/>
+  </w:num>
+  <w:num w:numId="75" w16cid:durableId="1907451556">
+    <w:abstractNumId w:val="20"/>
+  </w:num>
+  <w:num w:numId="76" w16cid:durableId="476074149">
+    <w:abstractNumId w:val="89"/>
+  </w:num>
+  <w:num w:numId="77" w16cid:durableId="1549686311">
+    <w:abstractNumId w:val="23"/>
+  </w:num>
+  <w:num w:numId="78" w16cid:durableId="1262101896">
+    <w:abstractNumId w:val="80"/>
+  </w:num>
+  <w:num w:numId="79" w16cid:durableId="1559122300">
+    <w:abstractNumId w:val="103"/>
+  </w:num>
+  <w:num w:numId="80" w16cid:durableId="1881479335">
+    <w:abstractNumId w:val="77"/>
+  </w:num>
+  <w:num w:numId="81" w16cid:durableId="1644889375">
+    <w:abstractNumId w:val="96"/>
+  </w:num>
+  <w:num w:numId="82" w16cid:durableId="266809816">
     <w:abstractNumId w:val="45"/>
   </w:num>
-  <w:num w:numId="69" w16cid:durableId="399864210">
-    <w:abstractNumId w:val="78"/>
-  </w:num>
-  <w:num w:numId="70" w16cid:durableId="125855137">
-    <w:abstractNumId w:val="55"/>
-  </w:num>
-  <w:num w:numId="71" w16cid:durableId="688288430">
-    <w:abstractNumId w:val="30"/>
-  </w:num>
-  <w:num w:numId="72" w16cid:durableId="1774746457">
-    <w:abstractNumId w:val="49"/>
-  </w:num>
-  <w:num w:numId="73" w16cid:durableId="1410351349">
-    <w:abstractNumId w:val="67"/>
-  </w:num>
-  <w:num w:numId="74" w16cid:durableId="1829247184">
-    <w:abstractNumId w:val="34"/>
-  </w:num>
-  <w:num w:numId="75" w16cid:durableId="1907451556">
-    <w:abstractNumId w:val="17"/>
-  </w:num>
-  <w:num w:numId="76" w16cid:durableId="476074149">
-    <w:abstractNumId w:val="82"/>
-  </w:num>
-  <w:num w:numId="77" w16cid:durableId="1549686311">
-    <w:abstractNumId w:val="20"/>
-  </w:num>
-  <w:num w:numId="78" w16cid:durableId="1262101896">
-    <w:abstractNumId w:val="73"/>
-  </w:num>
-  <w:num w:numId="79" w16cid:durableId="1559122300">
-    <w:abstractNumId w:val="93"/>
-  </w:num>
-  <w:num w:numId="80" w16cid:durableId="1881479335">
-    <w:abstractNumId w:val="71"/>
-  </w:num>
-  <w:num w:numId="81" w16cid:durableId="1644889375">
-    <w:abstractNumId w:val="88"/>
-  </w:num>
-  <w:num w:numId="82" w16cid:durableId="266809816">
-    <w:abstractNumId w:val="41"/>
-  </w:num>
   <w:num w:numId="83" w16cid:durableId="1898975329">
-    <w:abstractNumId w:val="79"/>
+    <w:abstractNumId w:val="86"/>
   </w:num>
   <w:num w:numId="84" w16cid:durableId="921790582">
-    <w:abstractNumId w:val="23"/>
+    <w:abstractNumId w:val="27"/>
   </w:num>
   <w:num w:numId="85" w16cid:durableId="1216041000">
-    <w:abstractNumId w:val="46"/>
+    <w:abstractNumId w:val="50"/>
   </w:num>
   <w:num w:numId="86" w16cid:durableId="1230000132">
-    <w:abstractNumId w:val="58"/>
+    <w:abstractNumId w:val="64"/>
   </w:num>
   <w:num w:numId="87" w16cid:durableId="1151213614">
-    <w:abstractNumId w:val="94"/>
+    <w:abstractNumId w:val="104"/>
   </w:num>
   <w:num w:numId="88" w16cid:durableId="779648141">
-    <w:abstractNumId w:val="48"/>
+    <w:abstractNumId w:val="52"/>
   </w:num>
   <w:num w:numId="89" w16cid:durableId="1661083049">
-    <w:abstractNumId w:val="6"/>
+    <w:abstractNumId w:val="7"/>
   </w:num>
   <w:num w:numId="90" w16cid:durableId="1078475948">
-    <w:abstractNumId w:val="28"/>
+    <w:abstractNumId w:val="32"/>
   </w:num>
   <w:num w:numId="91" w16cid:durableId="7105176">
-    <w:abstractNumId w:val="69"/>
+    <w:abstractNumId w:val="75"/>
   </w:num>
   <w:num w:numId="92" w16cid:durableId="20787591">
-    <w:abstractNumId w:val="40"/>
+    <w:abstractNumId w:val="44"/>
   </w:num>
   <w:num w:numId="93" w16cid:durableId="2070494462">
-    <w:abstractNumId w:val="57"/>
+    <w:abstractNumId w:val="63"/>
   </w:num>
   <w:num w:numId="94" w16cid:durableId="152258199">
-    <w:abstractNumId w:val="16"/>
+    <w:abstractNumId w:val="19"/>
   </w:num>
   <w:num w:numId="95" w16cid:durableId="332027457">
-    <w:abstractNumId w:val="70"/>
+    <w:abstractNumId w:val="76"/>
   </w:num>
   <w:num w:numId="96" w16cid:durableId="1652637883">
-    <w:abstractNumId w:val="24"/>
+    <w:abstractNumId w:val="28"/>
   </w:num>
   <w:num w:numId="97" w16cid:durableId="1237008859">
     <w:abstractNumId w:val="2"/>
   </w:num>
   <w:num w:numId="98" w16cid:durableId="676424320">
-    <w:abstractNumId w:val="47"/>
+    <w:abstractNumId w:val="51"/>
   </w:num>
   <w:num w:numId="99" w16cid:durableId="1044448274">
-    <w:abstractNumId w:val="92"/>
+    <w:abstractNumId w:val="101"/>
+  </w:num>
+  <w:num w:numId="100" w16cid:durableId="441801916">
+    <w:abstractNumId w:val="97"/>
+  </w:num>
+  <w:num w:numId="101" w16cid:durableId="434790148">
+    <w:abstractNumId w:val="78"/>
+  </w:num>
+  <w:num w:numId="102" w16cid:durableId="454905697">
+    <w:abstractNumId w:val="95"/>
+  </w:num>
+  <w:num w:numId="103" w16cid:durableId="1840731875">
+    <w:abstractNumId w:val="102"/>
+  </w:num>
+  <w:num w:numId="104" w16cid:durableId="1922332760">
+    <w:abstractNumId w:val="13"/>
+  </w:num>
+  <w:num w:numId="105" w16cid:durableId="1200508534">
+    <w:abstractNumId w:val="58"/>
+  </w:num>
+  <w:num w:numId="106" w16cid:durableId="348803123">
+    <w:abstractNumId w:val="3"/>
+  </w:num>
+  <w:num w:numId="107" w16cid:durableId="435366611">
+    <w:abstractNumId w:val="10"/>
+  </w:num>
+  <w:num w:numId="108" w16cid:durableId="4015072">
+    <w:abstractNumId w:val="25"/>
+  </w:num>
+  <w:num w:numId="109" w16cid:durableId="679084656">
+    <w:abstractNumId w:val="62"/>
   </w:num>
 </w:numbering>
 </file>

</xml_diff>